<commit_message>
fine tuned the generator part,added the actual requirements,changed the execution output for better visibility
</commit_message>
<xml_diff>
--- a/requirements.docx
+++ b/requirements.docx
@@ -7,7 +7,7 @@
         <w:tblStyle w:val="3"/>
         <w:tblpPr w:leftFromText="180" w:rightFromText="180" w:vertAnchor="page" w:horzAnchor="page" w:tblpX="897" w:tblpY="1558"/>
         <w:tblOverlap w:val="never"/>
-        <w:tblW w:w="10760" w:type="dxa"/>
+        <w:tblW w:w="12930" w:type="dxa"/>
         <w:tblInd w:w="0" w:type="dxa"/>
         <w:tblBorders>
           <w:top w:val="none" w:color="auto" w:sz="0" w:space="0"/>
@@ -18,7 +18,7 @@
           <w:insideV w:val="none" w:color="auto" w:sz="0" w:space="0"/>
         </w:tblBorders>
         <w:shd w:val="clear" w:color="auto" w:fill="auto"/>
-        <w:tblLayout w:type="autofit"/>
+        <w:tblLayout w:type="fixed"/>
         <w:tblCellMar>
           <w:top w:w="0" w:type="dxa"/>
           <w:left w:w="108" w:type="dxa"/>
@@ -29,9 +29,10 @@
       <w:tblGrid>
         <w:gridCol w:w="1880"/>
         <w:gridCol w:w="2270"/>
-        <w:gridCol w:w="2780"/>
-        <w:gridCol w:w="1660"/>
-        <w:gridCol w:w="2170"/>
+        <w:gridCol w:w="1280"/>
+        <w:gridCol w:w="1510"/>
+        <w:gridCol w:w="1100"/>
+        <w:gridCol w:w="4890"/>
       </w:tblGrid>
       <w:tr>
         <w:tblPrEx>
@@ -87,17 +88,9 @@
             </w:pPr>
             <w:r>
               <w:rPr>
-                <w:rFonts w:hint="default" w:ascii="Calibri" w:hAnsi="Calibri" w:eastAsia="SimSun" w:cs="Calibri"/>
-                <w:i w:val="0"/>
-                <w:iCs w:val="0"/>
-                <w:color w:val="000000"/>
-                <w:kern w:val="0"/>
-                <w:sz w:val="22"/>
-                <w:szCs w:val="22"/>
-                <w:u w:val="none"/>
-                <w:lang w:val="en-US" w:eastAsia="zh-CN" w:bidi="ar"/>
-              </w:rPr>
-              <w:t>company</w:t>
+                <w:rFonts w:hint="default"/>
+              </w:rPr>
+              <w:t>Security</w:t>
             </w:r>
           </w:p>
         </w:tc>
@@ -134,23 +127,15 @@
             </w:pPr>
             <w:r>
               <w:rPr>
-                <w:rFonts w:hint="default" w:ascii="Calibri" w:hAnsi="Calibri" w:eastAsia="SimSun" w:cs="Calibri"/>
-                <w:i w:val="0"/>
-                <w:iCs w:val="0"/>
-                <w:color w:val="000000"/>
-                <w:kern w:val="0"/>
-                <w:sz w:val="22"/>
-                <w:szCs w:val="22"/>
-                <w:u w:val="none"/>
-                <w:lang w:val="en-US" w:eastAsia="zh-CN" w:bidi="ar"/>
-              </w:rPr>
-              <w:t>Target Share Percentage</w:t>
-            </w:r>
-          </w:p>
-        </w:tc>
-        <w:tc>
-          <w:tcPr>
-            <w:tcW w:w="2780" w:type="dxa"/>
+                <w:rFonts w:hint="default"/>
+              </w:rPr>
+              <w:t xml:space="preserve"> target%</w:t>
+            </w:r>
+          </w:p>
+        </w:tc>
+        <w:tc>
+          <w:tcPr>
+            <w:tcW w:w="1280" w:type="dxa"/>
             <w:tcBorders>
               <w:top w:val="nil"/>
               <w:left w:val="nil"/>
@@ -181,33 +166,51 @@
             </w:pPr>
             <w:r>
               <w:rPr>
-                <w:rFonts w:hint="default" w:ascii="Calibri" w:hAnsi="Calibri" w:eastAsia="SimSun" w:cs="Calibri"/>
-                <w:i w:val="0"/>
-                <w:iCs w:val="0"/>
-                <w:color w:val="000000"/>
-                <w:kern w:val="0"/>
-                <w:sz w:val="22"/>
-                <w:szCs w:val="22"/>
-                <w:u w:val="none"/>
-                <w:lang w:val="en-US" w:eastAsia="zh-CN" w:bidi="ar"/>
-              </w:rPr>
-              <w:t>Current Share Percentage</w:t>
-            </w:r>
-          </w:p>
-        </w:tc>
-        <w:tc>
-          <w:tcPr>
-            <w:tcW w:w="1660" w:type="dxa"/>
-            <w:tcBorders>
-              <w:top w:val="nil"/>
-              <w:left w:val="nil"/>
-              <w:bottom w:val="nil"/>
-              <w:right w:val="nil"/>
-            </w:tcBorders>
-            <w:shd w:val="clear" w:color="auto" w:fill="auto"/>
-            <w:noWrap/>
-            <w:vAlign w:val="center"/>
-          </w:tcPr>
+                <w:rFonts w:hint="default"/>
+              </w:rPr>
+              <w:t xml:space="preserve"> current%</w:t>
+            </w:r>
+          </w:p>
+        </w:tc>
+        <w:tc>
+          <w:tcPr>
+            <w:tcW w:w="1510" w:type="dxa"/>
+            <w:tcBorders>
+              <w:top w:val="nil"/>
+              <w:left w:val="nil"/>
+              <w:bottom w:val="nil"/>
+              <w:right w:val="nil"/>
+            </w:tcBorders>
+            <w:shd w:val="clear" w:color="auto" w:fill="auto"/>
+            <w:noWrap/>
+            <w:vAlign w:val="center"/>
+          </w:tcPr>
+          <w:p>
+            <w:pPr>
+              <w:rPr>
+                <w:rFonts w:hint="default"/>
+              </w:rPr>
+            </w:pPr>
+            <w:r>
+              <w:rPr>
+                <w:rFonts w:hint="default"/>
+              </w:rPr>
+              <w:t>target</w:t>
+            </w:r>
+          </w:p>
+          <w:p>
+            <w:pPr>
+              <w:rPr>
+                <w:rFonts w:hint="default"/>
+              </w:rPr>
+            </w:pPr>
+            <w:r>
+              <w:rPr>
+                <w:rFonts w:hint="default"/>
+              </w:rPr>
+              <w:t>Variance</w:t>
+            </w:r>
+          </w:p>
           <w:p>
             <w:pPr>
               <w:keepNext w:val="0"/>
@@ -226,25 +229,11 @@
                 <w:u w:val="none"/>
               </w:rPr>
             </w:pPr>
-            <w:r>
-              <w:rPr>
-                <w:rFonts w:hint="default" w:ascii="Calibri" w:hAnsi="Calibri" w:eastAsia="SimSun" w:cs="Calibri"/>
-                <w:i w:val="0"/>
-                <w:iCs w:val="0"/>
-                <w:color w:val="000000"/>
-                <w:kern w:val="0"/>
-                <w:sz w:val="22"/>
-                <w:szCs w:val="22"/>
-                <w:u w:val="none"/>
-                <w:lang w:val="en-US" w:eastAsia="zh-CN" w:bidi="ar"/>
-              </w:rPr>
-              <w:t>Deviation</w:t>
-            </w:r>
-          </w:p>
-        </w:tc>
-        <w:tc>
-          <w:tcPr>
-            <w:tcW w:w="2170" w:type="dxa"/>
+          </w:p>
+        </w:tc>
+        <w:tc>
+          <w:tcPr>
+            <w:tcW w:w="1100" w:type="dxa"/>
             <w:tcBorders>
               <w:top w:val="nil"/>
               <w:left w:val="nil"/>
@@ -289,40 +278,71 @@
             </w:r>
           </w:p>
         </w:tc>
-      </w:tr>
-      <w:tr>
-        <w:tblPrEx>
-          <w:tblBorders>
-            <w:top w:val="none" w:color="auto" w:sz="0" w:space="0"/>
-            <w:left w:val="none" w:color="auto" w:sz="0" w:space="0"/>
-            <w:bottom w:val="none" w:color="auto" w:sz="0" w:space="0"/>
-            <w:right w:val="none" w:color="auto" w:sz="0" w:space="0"/>
-            <w:insideH w:val="none" w:color="auto" w:sz="0" w:space="0"/>
-            <w:insideV w:val="none" w:color="auto" w:sz="0" w:space="0"/>
-          </w:tblBorders>
-          <w:tblCellMar>
-            <w:top w:w="0" w:type="dxa"/>
-            <w:left w:w="108" w:type="dxa"/>
-            <w:bottom w:w="0" w:type="dxa"/>
-            <w:right w:w="108" w:type="dxa"/>
-          </w:tblCellMar>
-        </w:tblPrEx>
-        <w:trPr>
-          <w:trHeight w:val="290" w:hRule="atLeast"/>
-        </w:trPr>
-        <w:tc>
-          <w:tcPr>
-            <w:tcW w:w="0" w:type="auto"/>
-            <w:tcBorders>
-              <w:top w:val="nil"/>
-              <w:left w:val="nil"/>
-              <w:bottom w:val="nil"/>
-              <w:right w:val="nil"/>
-            </w:tcBorders>
-            <w:shd w:val="clear" w:color="auto" w:fill="auto"/>
-            <w:noWrap/>
-            <w:vAlign w:val="center"/>
-          </w:tcPr>
+        <w:tc>
+          <w:tcPr>
+            <w:tcW w:w="4890" w:type="dxa"/>
+            <w:tcBorders>
+              <w:top w:val="nil"/>
+              <w:left w:val="nil"/>
+              <w:bottom w:val="nil"/>
+              <w:right w:val="nil"/>
+            </w:tcBorders>
+            <w:shd w:val="clear" w:color="auto" w:fill="auto"/>
+            <w:noWrap/>
+            <w:vAlign w:val="center"/>
+          </w:tcPr>
+          <w:p>
+            <w:pPr>
+              <w:rPr>
+                <w:rFonts w:hint="default"/>
+              </w:rPr>
+            </w:pPr>
+            <w:r>
+              <w:rPr>
+                <w:rFonts w:hint="default"/>
+              </w:rPr>
+              <w:t>Output -</w:t>
+            </w:r>
+          </w:p>
+          <w:p>
+            <w:pPr>
+              <w:rPr>
+                <w:rFonts w:hint="default"/>
+              </w:rPr>
+            </w:pPr>
+            <w:r>
+              <w:rPr>
+                <w:rFonts w:hint="default"/>
+              </w:rPr>
+              <w:t>Number of</w:t>
+            </w:r>
+          </w:p>
+          <w:p>
+            <w:pPr>
+              <w:rPr>
+                <w:rFonts w:hint="default"/>
+              </w:rPr>
+            </w:pPr>
+            <w:r>
+              <w:rPr>
+                <w:rFonts w:hint="default"/>
+              </w:rPr>
+              <w:t>shares to</w:t>
+            </w:r>
+          </w:p>
+          <w:p>
+            <w:pPr>
+              <w:rPr>
+                <w:rFonts w:hint="default"/>
+              </w:rPr>
+            </w:pPr>
+            <w:r>
+              <w:rPr>
+                <w:rFonts w:hint="default"/>
+              </w:rPr>
+              <w:t>buy/sell</w:t>
+            </w:r>
+          </w:p>
           <w:p>
             <w:pPr>
               <w:keepNext w:val="0"/>
@@ -332,487 +352,17 @@
               <w:jc w:val="left"/>
               <w:textAlignment w:val="center"/>
               <w:rPr>
-                <w:rFonts w:hint="default" w:ascii="Calibri" w:hAnsi="Calibri" w:cs="Calibri"/>
-                <w:i w:val="0"/>
-                <w:iCs w:val="0"/>
-                <w:color w:val="000000"/>
-                <w:sz w:val="22"/>
-                <w:szCs w:val="22"/>
-                <w:u w:val="none"/>
-              </w:rPr>
-            </w:pPr>
-            <w:r>
-              <w:rPr>
-                <w:rFonts w:hint="default" w:ascii="Calibri" w:hAnsi="Calibri" w:eastAsia="SimSun" w:cs="Calibri"/>
-                <w:i w:val="0"/>
-                <w:iCs w:val="0"/>
-                <w:color w:val="000000"/>
-                <w:kern w:val="0"/>
-                <w:sz w:val="22"/>
-                <w:szCs w:val="22"/>
-                <w:u w:val="none"/>
-                <w:lang w:val="en-US" w:eastAsia="zh-CN" w:bidi="ar"/>
-              </w:rPr>
-              <w:t>A</w:t>
-            </w:r>
-          </w:p>
-        </w:tc>
-        <w:tc>
-          <w:tcPr>
-            <w:tcW w:w="0" w:type="auto"/>
-            <w:tcBorders>
-              <w:top w:val="nil"/>
-              <w:left w:val="nil"/>
-              <w:bottom w:val="nil"/>
-              <w:right w:val="nil"/>
-            </w:tcBorders>
-            <w:shd w:val="clear" w:color="auto" w:fill="auto"/>
-            <w:noWrap/>
-            <w:vAlign w:val="center"/>
-          </w:tcPr>
-          <w:p>
-            <w:pPr>
-              <w:keepNext w:val="0"/>
-              <w:keepLines w:val="0"/>
-              <w:widowControl/>
-              <w:suppressLineNumbers w:val="0"/>
-              <w:jc w:val="right"/>
-              <w:textAlignment w:val="center"/>
-              <w:rPr>
-                <w:rFonts w:hint="default" w:ascii="Calibri" w:hAnsi="Calibri" w:cs="Calibri"/>
-                <w:i w:val="0"/>
-                <w:iCs w:val="0"/>
-                <w:color w:val="000000"/>
-                <w:sz w:val="22"/>
-                <w:szCs w:val="22"/>
-                <w:u w:val="none"/>
-              </w:rPr>
-            </w:pPr>
-            <w:r>
-              <w:rPr>
-                <w:rFonts w:hint="default" w:ascii="Calibri" w:hAnsi="Calibri" w:eastAsia="SimSun" w:cs="Calibri"/>
-                <w:i w:val="0"/>
-                <w:iCs w:val="0"/>
-                <w:color w:val="000000"/>
-                <w:kern w:val="0"/>
-                <w:sz w:val="22"/>
-                <w:szCs w:val="22"/>
-                <w:u w:val="none"/>
-                <w:lang w:val="en-US" w:eastAsia="zh-CN" w:bidi="ar"/>
-              </w:rPr>
-              <w:t>20</w:t>
-            </w:r>
-          </w:p>
-        </w:tc>
-        <w:tc>
-          <w:tcPr>
-            <w:tcW w:w="0" w:type="auto"/>
-            <w:tcBorders>
-              <w:top w:val="nil"/>
-              <w:left w:val="nil"/>
-              <w:bottom w:val="nil"/>
-              <w:right w:val="nil"/>
-            </w:tcBorders>
-            <w:shd w:val="clear" w:color="auto" w:fill="auto"/>
-            <w:noWrap/>
-            <w:vAlign w:val="center"/>
-          </w:tcPr>
-          <w:p>
-            <w:pPr>
-              <w:keepNext w:val="0"/>
-              <w:keepLines w:val="0"/>
-              <w:widowControl/>
-              <w:suppressLineNumbers w:val="0"/>
-              <w:jc w:val="right"/>
-              <w:textAlignment w:val="center"/>
-              <w:rPr>
-                <w:rFonts w:hint="default" w:ascii="Calibri" w:hAnsi="Calibri" w:cs="Calibri"/>
-                <w:i w:val="0"/>
-                <w:iCs w:val="0"/>
-                <w:color w:val="000000"/>
-                <w:sz w:val="22"/>
-                <w:szCs w:val="22"/>
-                <w:u w:val="none"/>
-              </w:rPr>
-            </w:pPr>
-            <w:r>
-              <w:rPr>
-                <w:rFonts w:hint="default" w:ascii="Calibri" w:hAnsi="Calibri" w:eastAsia="SimSun" w:cs="Calibri"/>
-                <w:i w:val="0"/>
-                <w:iCs w:val="0"/>
-                <w:color w:val="000000"/>
-                <w:kern w:val="0"/>
-                <w:sz w:val="22"/>
-                <w:szCs w:val="22"/>
-                <w:u w:val="none"/>
-                <w:lang w:val="en-US" w:eastAsia="zh-CN" w:bidi="ar"/>
-              </w:rPr>
-              <w:t>10</w:t>
-            </w:r>
-          </w:p>
-        </w:tc>
-        <w:tc>
-          <w:tcPr>
-            <w:tcW w:w="0" w:type="auto"/>
-            <w:tcBorders>
-              <w:top w:val="nil"/>
-              <w:left w:val="nil"/>
-              <w:bottom w:val="nil"/>
-              <w:right w:val="nil"/>
-            </w:tcBorders>
-            <w:shd w:val="clear" w:color="auto" w:fill="auto"/>
-            <w:noWrap/>
-            <w:vAlign w:val="center"/>
-          </w:tcPr>
-          <w:p>
-            <w:pPr>
-              <w:keepNext w:val="0"/>
-              <w:keepLines w:val="0"/>
-              <w:widowControl/>
-              <w:suppressLineNumbers w:val="0"/>
-              <w:jc w:val="right"/>
-              <w:textAlignment w:val="center"/>
-              <w:rPr>
-                <w:rFonts w:hint="default" w:ascii="Calibri" w:hAnsi="Calibri" w:cs="Calibri"/>
-                <w:i w:val="0"/>
-                <w:iCs w:val="0"/>
-                <w:color w:val="000000"/>
-                <w:sz w:val="22"/>
-                <w:szCs w:val="22"/>
-                <w:u w:val="none"/>
-              </w:rPr>
-            </w:pPr>
-            <w:r>
-              <w:rPr>
-                <w:rFonts w:hint="default" w:ascii="Calibri" w:hAnsi="Calibri" w:eastAsia="SimSun" w:cs="Calibri"/>
-                <w:i w:val="0"/>
-                <w:iCs w:val="0"/>
-                <w:color w:val="000000"/>
-                <w:kern w:val="0"/>
-                <w:sz w:val="22"/>
-                <w:szCs w:val="22"/>
-                <w:u w:val="none"/>
-                <w:lang w:val="en-US" w:eastAsia="zh-CN" w:bidi="ar"/>
-              </w:rPr>
-              <w:t>10</w:t>
-            </w:r>
-          </w:p>
-        </w:tc>
-        <w:tc>
-          <w:tcPr>
-            <w:tcW w:w="0" w:type="auto"/>
-            <w:tcBorders>
-              <w:top w:val="nil"/>
-              <w:left w:val="nil"/>
-              <w:bottom w:val="nil"/>
-              <w:right w:val="nil"/>
-            </w:tcBorders>
-            <w:shd w:val="clear" w:color="auto" w:fill="auto"/>
-            <w:noWrap/>
-            <w:vAlign w:val="center"/>
-          </w:tcPr>
-          <w:p>
-            <w:pPr>
-              <w:keepNext w:val="0"/>
-              <w:keepLines w:val="0"/>
-              <w:widowControl/>
-              <w:suppressLineNumbers w:val="0"/>
-              <w:jc w:val="right"/>
-              <w:textAlignment w:val="center"/>
-              <w:rPr>
-                <w:rFonts w:hint="default" w:ascii="Calibri" w:hAnsi="Calibri" w:cs="Calibri"/>
-                <w:i w:val="0"/>
-                <w:iCs w:val="0"/>
-                <w:color w:val="000000"/>
-                <w:sz w:val="22"/>
-                <w:szCs w:val="22"/>
-                <w:u w:val="none"/>
-              </w:rPr>
-            </w:pPr>
-            <w:r>
-              <w:rPr>
-                <w:rFonts w:hint="default" w:ascii="Calibri" w:hAnsi="Calibri" w:eastAsia="SimSun" w:cs="Calibri"/>
-                <w:i w:val="0"/>
-                <w:iCs w:val="0"/>
-                <w:color w:val="000000"/>
-                <w:kern w:val="0"/>
-                <w:sz w:val="22"/>
-                <w:szCs w:val="22"/>
-                <w:u w:val="none"/>
-                <w:lang w:val="en-US" w:eastAsia="zh-CN" w:bidi="ar"/>
-              </w:rPr>
-              <w:t>400</w:t>
-            </w:r>
-          </w:p>
-        </w:tc>
-      </w:tr>
-      <w:tr>
-        <w:tblPrEx>
-          <w:tblBorders>
-            <w:top w:val="none" w:color="auto" w:sz="0" w:space="0"/>
-            <w:left w:val="none" w:color="auto" w:sz="0" w:space="0"/>
-            <w:bottom w:val="none" w:color="auto" w:sz="0" w:space="0"/>
-            <w:right w:val="none" w:color="auto" w:sz="0" w:space="0"/>
-            <w:insideH w:val="none" w:color="auto" w:sz="0" w:space="0"/>
-            <w:insideV w:val="none" w:color="auto" w:sz="0" w:space="0"/>
-          </w:tblBorders>
-          <w:tblCellMar>
-            <w:top w:w="0" w:type="dxa"/>
-            <w:left w:w="108" w:type="dxa"/>
-            <w:bottom w:w="0" w:type="dxa"/>
-            <w:right w:w="108" w:type="dxa"/>
-          </w:tblCellMar>
-        </w:tblPrEx>
-        <w:trPr>
-          <w:trHeight w:val="190" w:hRule="atLeast"/>
-        </w:trPr>
-        <w:tc>
-          <w:tcPr>
-            <w:tcW w:w="0" w:type="auto"/>
-            <w:tcBorders>
-              <w:top w:val="nil"/>
-              <w:left w:val="nil"/>
-              <w:bottom w:val="nil"/>
-              <w:right w:val="nil"/>
-            </w:tcBorders>
-            <w:shd w:val="clear" w:color="auto" w:fill="auto"/>
-            <w:noWrap/>
-            <w:vAlign w:val="center"/>
-          </w:tcPr>
-          <w:p>
-            <w:pPr>
-              <w:keepNext w:val="0"/>
-              <w:keepLines w:val="0"/>
-              <w:widowControl/>
-              <w:suppressLineNumbers w:val="0"/>
-              <w:jc w:val="left"/>
-              <w:textAlignment w:val="center"/>
-              <w:rPr>
-                <w:rFonts w:hint="default" w:ascii="Calibri" w:hAnsi="Calibri" w:cs="Calibri"/>
-                <w:i w:val="0"/>
-                <w:iCs w:val="0"/>
-                <w:color w:val="000000"/>
-                <w:sz w:val="22"/>
-                <w:szCs w:val="22"/>
-                <w:u w:val="none"/>
-              </w:rPr>
-            </w:pPr>
-            <w:r>
-              <w:rPr>
-                <w:rFonts w:hint="default" w:ascii="Calibri" w:hAnsi="Calibri" w:eastAsia="SimSun" w:cs="Calibri"/>
-                <w:i w:val="0"/>
-                <w:iCs w:val="0"/>
-                <w:color w:val="000000"/>
-                <w:kern w:val="0"/>
-                <w:sz w:val="22"/>
-                <w:szCs w:val="22"/>
-                <w:u w:val="none"/>
-                <w:lang w:val="en-US" w:eastAsia="zh-CN" w:bidi="ar"/>
-              </w:rPr>
-              <w:t>B</w:t>
-            </w:r>
-          </w:p>
-        </w:tc>
-        <w:tc>
-          <w:tcPr>
-            <w:tcW w:w="0" w:type="auto"/>
-            <w:tcBorders>
-              <w:top w:val="nil"/>
-              <w:left w:val="nil"/>
-              <w:bottom w:val="nil"/>
-              <w:right w:val="nil"/>
-            </w:tcBorders>
-            <w:shd w:val="clear" w:color="auto" w:fill="auto"/>
-            <w:noWrap/>
-            <w:vAlign w:val="center"/>
-          </w:tcPr>
-          <w:p>
-            <w:pPr>
-              <w:keepNext w:val="0"/>
-              <w:keepLines w:val="0"/>
-              <w:widowControl/>
-              <w:suppressLineNumbers w:val="0"/>
-              <w:jc w:val="right"/>
-              <w:textAlignment w:val="center"/>
-              <w:rPr>
-                <w:rFonts w:hint="default" w:ascii="Calibri" w:hAnsi="Calibri" w:cs="Calibri"/>
-                <w:i w:val="0"/>
-                <w:iCs w:val="0"/>
-                <w:color w:val="000000"/>
-                <w:sz w:val="22"/>
-                <w:szCs w:val="22"/>
-                <w:u w:val="none"/>
-              </w:rPr>
-            </w:pPr>
-            <w:r>
-              <w:rPr>
-                <w:rFonts w:hint="default" w:ascii="Calibri" w:hAnsi="Calibri" w:eastAsia="SimSun" w:cs="Calibri"/>
-                <w:i w:val="0"/>
-                <w:iCs w:val="0"/>
-                <w:color w:val="000000"/>
-                <w:kern w:val="0"/>
-                <w:sz w:val="22"/>
-                <w:szCs w:val="22"/>
-                <w:u w:val="none"/>
-                <w:lang w:val="en-US" w:eastAsia="zh-CN" w:bidi="ar"/>
-              </w:rPr>
-              <w:t>20</w:t>
-            </w:r>
-          </w:p>
-        </w:tc>
-        <w:tc>
-          <w:tcPr>
-            <w:tcW w:w="0" w:type="auto"/>
-            <w:tcBorders>
-              <w:top w:val="nil"/>
-              <w:left w:val="nil"/>
-              <w:bottom w:val="nil"/>
-              <w:right w:val="nil"/>
-            </w:tcBorders>
-            <w:shd w:val="clear" w:color="auto" w:fill="auto"/>
-            <w:noWrap/>
-            <w:vAlign w:val="center"/>
-          </w:tcPr>
-          <w:p>
-            <w:pPr>
-              <w:keepNext w:val="0"/>
-              <w:keepLines w:val="0"/>
-              <w:widowControl/>
-              <w:suppressLineNumbers w:val="0"/>
-              <w:jc w:val="right"/>
-              <w:textAlignment w:val="center"/>
-              <w:rPr>
-                <w:rFonts w:hint="default" w:ascii="Calibri" w:hAnsi="Calibri" w:cs="Calibri"/>
-                <w:i w:val="0"/>
-                <w:iCs w:val="0"/>
-                <w:color w:val="000000"/>
-                <w:sz w:val="22"/>
-                <w:szCs w:val="22"/>
-                <w:u w:val="none"/>
-              </w:rPr>
-            </w:pPr>
-            <w:r>
-              <w:rPr>
-                <w:rFonts w:hint="default" w:ascii="Calibri" w:hAnsi="Calibri" w:eastAsia="SimSun" w:cs="Calibri"/>
-                <w:i w:val="0"/>
-                <w:iCs w:val="0"/>
-                <w:color w:val="000000"/>
-                <w:kern w:val="0"/>
-                <w:sz w:val="22"/>
-                <w:szCs w:val="22"/>
-                <w:u w:val="none"/>
-                <w:lang w:val="en-US" w:eastAsia="zh-CN" w:bidi="ar"/>
-              </w:rPr>
-              <w:t>30</w:t>
-            </w:r>
-          </w:p>
-        </w:tc>
-        <w:tc>
-          <w:tcPr>
-            <w:tcW w:w="0" w:type="auto"/>
-            <w:tcBorders>
-              <w:top w:val="nil"/>
-              <w:left w:val="nil"/>
-              <w:bottom w:val="nil"/>
-              <w:right w:val="nil"/>
-            </w:tcBorders>
-            <w:shd w:val="clear" w:color="auto" w:fill="auto"/>
-            <w:noWrap/>
-            <w:vAlign w:val="center"/>
-          </w:tcPr>
-          <w:p>
-            <w:pPr>
-              <w:keepNext w:val="0"/>
-              <w:keepLines w:val="0"/>
-              <w:widowControl/>
-              <w:suppressLineNumbers w:val="0"/>
-              <w:jc w:val="right"/>
-              <w:textAlignment w:val="center"/>
-              <w:rPr>
-                <w:rFonts w:hint="default" w:ascii="Calibri" w:hAnsi="Calibri" w:cs="Calibri"/>
-                <w:i w:val="0"/>
-                <w:iCs w:val="0"/>
-                <w:color w:val="000000"/>
-                <w:sz w:val="22"/>
-                <w:szCs w:val="22"/>
-                <w:u w:val="none"/>
-              </w:rPr>
-            </w:pPr>
-            <w:r>
-              <w:rPr>
-                <w:rFonts w:hint="default" w:ascii="Calibri" w:hAnsi="Calibri" w:eastAsia="SimSun" w:cs="Calibri"/>
-                <w:i w:val="0"/>
-                <w:iCs w:val="0"/>
-                <w:color w:val="000000"/>
-                <w:kern w:val="0"/>
-                <w:sz w:val="22"/>
-                <w:szCs w:val="22"/>
-                <w:u w:val="none"/>
-                <w:lang w:val="en-IN" w:eastAsia="zh-CN" w:bidi="ar"/>
-              </w:rPr>
-              <w:t>-</w:t>
-            </w:r>
-            <w:r>
-              <w:rPr>
-                <w:rFonts w:hint="default" w:ascii="Calibri" w:hAnsi="Calibri" w:eastAsia="SimSun" w:cs="Calibri"/>
-                <w:i w:val="0"/>
-                <w:iCs w:val="0"/>
-                <w:color w:val="000000"/>
-                <w:kern w:val="0"/>
-                <w:sz w:val="22"/>
-                <w:szCs w:val="22"/>
-                <w:u w:val="none"/>
-                <w:lang w:val="en-US" w:eastAsia="zh-CN" w:bidi="ar"/>
-              </w:rPr>
-              <w:t>10</w:t>
-            </w:r>
-          </w:p>
-        </w:tc>
-        <w:tc>
-          <w:tcPr>
-            <w:tcW w:w="0" w:type="auto"/>
-            <w:tcBorders>
-              <w:top w:val="nil"/>
-              <w:left w:val="nil"/>
-              <w:bottom w:val="nil"/>
-              <w:right w:val="nil"/>
-            </w:tcBorders>
-            <w:shd w:val="clear" w:color="auto" w:fill="auto"/>
-            <w:noWrap/>
-            <w:vAlign w:val="center"/>
-          </w:tcPr>
-          <w:p>
-            <w:pPr>
-              <w:keepNext w:val="0"/>
-              <w:keepLines w:val="0"/>
-              <w:widowControl/>
-              <w:suppressLineNumbers w:val="0"/>
-              <w:jc w:val="right"/>
-              <w:textAlignment w:val="center"/>
-              <w:rPr>
-                <w:rFonts w:hint="default" w:ascii="Calibri" w:hAnsi="Calibri" w:cs="Calibri"/>
-                <w:i w:val="0"/>
-                <w:iCs w:val="0"/>
-                <w:color w:val="000000"/>
-                <w:sz w:val="22"/>
-                <w:szCs w:val="22"/>
-                <w:u w:val="none"/>
-              </w:rPr>
-            </w:pPr>
-            <w:r>
-              <w:rPr>
-                <w:rFonts w:hint="default" w:ascii="Calibri" w:hAnsi="Calibri" w:eastAsia="SimSun" w:cs="Calibri"/>
-                <w:i w:val="0"/>
-                <w:iCs w:val="0"/>
-                <w:color w:val="000000"/>
-                <w:kern w:val="0"/>
-                <w:sz w:val="22"/>
-                <w:szCs w:val="22"/>
-                <w:u w:val="none"/>
-                <w:lang w:val="en-US" w:eastAsia="zh-CN" w:bidi="ar"/>
-              </w:rPr>
-              <w:t>90</w:t>
-            </w:r>
+                <w:rFonts w:hint="default" w:ascii="Calibri" w:hAnsi="Calibri" w:eastAsia="SimSun" w:cs="Calibri"/>
+                <w:i w:val="0"/>
+                <w:iCs w:val="0"/>
+                <w:color w:val="000000"/>
+                <w:kern w:val="0"/>
+                <w:sz w:val="22"/>
+                <w:szCs w:val="22"/>
+                <w:u w:val="none"/>
+                <w:lang w:val="en-US" w:eastAsia="zh-CN" w:bidi="ar"/>
+              </w:rPr>
+            </w:pPr>
           </w:p>
         </w:tc>
       </w:tr>
@@ -839,7 +389,7 @@
         </w:trPr>
         <w:tc>
           <w:tcPr>
-            <w:tcW w:w="0" w:type="auto"/>
+            <w:tcW w:w="1880" w:type="dxa"/>
             <w:tcBorders>
               <w:top w:val="nil"/>
               <w:left w:val="nil"/>
@@ -880,13 +430,13 @@
                 <w:u w:val="none"/>
                 <w:lang w:val="en-US" w:eastAsia="zh-CN" w:bidi="ar"/>
               </w:rPr>
-              <w:t>C</w:t>
-            </w:r>
-          </w:p>
-        </w:tc>
-        <w:tc>
-          <w:tcPr>
-            <w:tcW w:w="0" w:type="auto"/>
+              <w:t>A</w:t>
+            </w:r>
+          </w:p>
+        </w:tc>
+        <w:tc>
+          <w:tcPr>
+            <w:tcW w:w="2270" w:type="dxa"/>
             <w:tcBorders>
               <w:top w:val="nil"/>
               <w:left w:val="nil"/>
@@ -933,7 +483,7 @@
         </w:tc>
         <w:tc>
           <w:tcPr>
-            <w:tcW w:w="0" w:type="auto"/>
+            <w:tcW w:w="1280" w:type="dxa"/>
             <w:tcBorders>
               <w:top w:val="nil"/>
               <w:left w:val="nil"/>
@@ -974,13 +524,258 @@
                 <w:u w:val="none"/>
                 <w:lang w:val="en-US" w:eastAsia="zh-CN" w:bidi="ar"/>
               </w:rPr>
+              <w:t>10</w:t>
+            </w:r>
+          </w:p>
+        </w:tc>
+        <w:tc>
+          <w:tcPr>
+            <w:tcW w:w="1510" w:type="dxa"/>
+            <w:tcBorders>
+              <w:top w:val="nil"/>
+              <w:left w:val="nil"/>
+              <w:bottom w:val="nil"/>
+              <w:right w:val="nil"/>
+            </w:tcBorders>
+            <w:shd w:val="clear" w:color="auto" w:fill="auto"/>
+            <w:noWrap/>
+            <w:vAlign w:val="center"/>
+          </w:tcPr>
+          <w:p>
+            <w:pPr>
+              <w:keepNext w:val="0"/>
+              <w:keepLines w:val="0"/>
+              <w:widowControl/>
+              <w:suppressLineNumbers w:val="0"/>
+              <w:jc w:val="right"/>
+              <w:textAlignment w:val="center"/>
+              <w:rPr>
+                <w:rFonts w:hint="default" w:ascii="Calibri" w:hAnsi="Calibri" w:cs="Calibri"/>
+                <w:i w:val="0"/>
+                <w:iCs w:val="0"/>
+                <w:color w:val="000000"/>
+                <w:sz w:val="22"/>
+                <w:szCs w:val="22"/>
+                <w:u w:val="none"/>
+              </w:rPr>
+            </w:pPr>
+            <w:r>
+              <w:rPr>
+                <w:rFonts w:hint="default" w:ascii="Calibri" w:hAnsi="Calibri" w:eastAsia="SimSun" w:cs="Calibri"/>
+                <w:i w:val="0"/>
+                <w:iCs w:val="0"/>
+                <w:color w:val="000000"/>
+                <w:kern w:val="0"/>
+                <w:sz w:val="22"/>
+                <w:szCs w:val="22"/>
+                <w:u w:val="none"/>
+                <w:lang w:val="en-US" w:eastAsia="zh-CN" w:bidi="ar"/>
+              </w:rPr>
+              <w:t>10</w:t>
+            </w:r>
+          </w:p>
+        </w:tc>
+        <w:tc>
+          <w:tcPr>
+            <w:tcW w:w="1100" w:type="dxa"/>
+            <w:tcBorders>
+              <w:top w:val="nil"/>
+              <w:left w:val="nil"/>
+              <w:bottom w:val="nil"/>
+              <w:right w:val="nil"/>
+            </w:tcBorders>
+            <w:shd w:val="clear" w:color="auto" w:fill="auto"/>
+            <w:noWrap/>
+            <w:vAlign w:val="center"/>
+          </w:tcPr>
+          <w:p>
+            <w:pPr>
+              <w:keepNext w:val="0"/>
+              <w:keepLines w:val="0"/>
+              <w:widowControl/>
+              <w:suppressLineNumbers w:val="0"/>
+              <w:jc w:val="right"/>
+              <w:textAlignment w:val="center"/>
+              <w:rPr>
+                <w:rFonts w:hint="default" w:ascii="Calibri" w:hAnsi="Calibri" w:cs="Calibri"/>
+                <w:i w:val="0"/>
+                <w:iCs w:val="0"/>
+                <w:color w:val="000000"/>
+                <w:sz w:val="22"/>
+                <w:szCs w:val="22"/>
+                <w:u w:val="none"/>
+              </w:rPr>
+            </w:pPr>
+            <w:r>
+              <w:rPr>
+                <w:rFonts w:hint="default" w:ascii="Calibri" w:hAnsi="Calibri" w:eastAsia="SimSun" w:cs="Calibri"/>
+                <w:i w:val="0"/>
+                <w:iCs w:val="0"/>
+                <w:color w:val="000000"/>
+                <w:kern w:val="0"/>
+                <w:sz w:val="22"/>
+                <w:szCs w:val="22"/>
+                <w:u w:val="none"/>
+                <w:lang w:val="en-US" w:eastAsia="zh-CN" w:bidi="ar"/>
+              </w:rPr>
+              <w:t>400</w:t>
+            </w:r>
+          </w:p>
+        </w:tc>
+        <w:tc>
+          <w:tcPr>
+            <w:tcW w:w="4890" w:type="dxa"/>
+            <w:tcBorders>
+              <w:top w:val="nil"/>
+              <w:left w:val="nil"/>
+              <w:bottom w:val="nil"/>
+              <w:right w:val="nil"/>
+            </w:tcBorders>
+            <w:shd w:val="clear" w:color="auto" w:fill="auto"/>
+            <w:noWrap/>
+            <w:vAlign w:val="center"/>
+          </w:tcPr>
+          <w:p>
+            <w:pPr>
+              <w:keepNext w:val="0"/>
+              <w:keepLines w:val="0"/>
+              <w:widowControl/>
+              <w:suppressLineNumbers w:val="0"/>
+              <w:jc w:val="right"/>
+              <w:textAlignment w:val="center"/>
+              <w:rPr>
+                <w:rFonts w:hint="default" w:ascii="Calibri" w:hAnsi="Calibri" w:eastAsia="SimSun" w:cs="Calibri"/>
+                <w:i w:val="0"/>
+                <w:iCs w:val="0"/>
+                <w:color w:val="000000"/>
+                <w:kern w:val="0"/>
+                <w:sz w:val="22"/>
+                <w:szCs w:val="22"/>
+                <w:u w:val="none"/>
+                <w:lang w:val="en-US" w:eastAsia="zh-CN" w:bidi="ar"/>
+              </w:rPr>
+            </w:pPr>
+          </w:p>
+        </w:tc>
+      </w:tr>
+      <w:tr>
+        <w:tblPrEx>
+          <w:tblBorders>
+            <w:top w:val="none" w:color="auto" w:sz="0" w:space="0"/>
+            <w:left w:val="none" w:color="auto" w:sz="0" w:space="0"/>
+            <w:bottom w:val="none" w:color="auto" w:sz="0" w:space="0"/>
+            <w:right w:val="none" w:color="auto" w:sz="0" w:space="0"/>
+            <w:insideH w:val="none" w:color="auto" w:sz="0" w:space="0"/>
+            <w:insideV w:val="none" w:color="auto" w:sz="0" w:space="0"/>
+          </w:tblBorders>
+          <w:shd w:val="clear" w:color="auto" w:fill="auto"/>
+          <w:tblCellMar>
+            <w:top w:w="0" w:type="dxa"/>
+            <w:left w:w="108" w:type="dxa"/>
+            <w:bottom w:w="0" w:type="dxa"/>
+            <w:right w:w="108" w:type="dxa"/>
+          </w:tblCellMar>
+        </w:tblPrEx>
+        <w:trPr>
+          <w:trHeight w:val="190" w:hRule="atLeast"/>
+        </w:trPr>
+        <w:tc>
+          <w:tcPr>
+            <w:tcW w:w="1880" w:type="dxa"/>
+            <w:tcBorders>
+              <w:top w:val="nil"/>
+              <w:left w:val="nil"/>
+              <w:bottom w:val="nil"/>
+              <w:right w:val="nil"/>
+            </w:tcBorders>
+            <w:shd w:val="clear" w:color="auto" w:fill="auto"/>
+            <w:noWrap/>
+            <w:vAlign w:val="center"/>
+          </w:tcPr>
+          <w:p>
+            <w:pPr>
+              <w:keepNext w:val="0"/>
+              <w:keepLines w:val="0"/>
+              <w:widowControl/>
+              <w:suppressLineNumbers w:val="0"/>
+              <w:jc w:val="left"/>
+              <w:textAlignment w:val="center"/>
+              <w:rPr>
+                <w:rFonts w:hint="default" w:ascii="Calibri" w:hAnsi="Calibri" w:cs="Calibri"/>
+                <w:i w:val="0"/>
+                <w:iCs w:val="0"/>
+                <w:color w:val="000000"/>
+                <w:sz w:val="22"/>
+                <w:szCs w:val="22"/>
+                <w:u w:val="none"/>
+              </w:rPr>
+            </w:pPr>
+            <w:r>
+              <w:rPr>
+                <w:rFonts w:hint="default" w:ascii="Calibri" w:hAnsi="Calibri" w:eastAsia="SimSun" w:cs="Calibri"/>
+                <w:i w:val="0"/>
+                <w:iCs w:val="0"/>
+                <w:color w:val="000000"/>
+                <w:kern w:val="0"/>
+                <w:sz w:val="22"/>
+                <w:szCs w:val="22"/>
+                <w:u w:val="none"/>
+                <w:lang w:val="en-US" w:eastAsia="zh-CN" w:bidi="ar"/>
+              </w:rPr>
+              <w:t>B</w:t>
+            </w:r>
+          </w:p>
+        </w:tc>
+        <w:tc>
+          <w:tcPr>
+            <w:tcW w:w="2270" w:type="dxa"/>
+            <w:tcBorders>
+              <w:top w:val="nil"/>
+              <w:left w:val="nil"/>
+              <w:bottom w:val="nil"/>
+              <w:right w:val="nil"/>
+            </w:tcBorders>
+            <w:shd w:val="clear" w:color="auto" w:fill="auto"/>
+            <w:noWrap/>
+            <w:vAlign w:val="center"/>
+          </w:tcPr>
+          <w:p>
+            <w:pPr>
+              <w:keepNext w:val="0"/>
+              <w:keepLines w:val="0"/>
+              <w:widowControl/>
+              <w:suppressLineNumbers w:val="0"/>
+              <w:jc w:val="right"/>
+              <w:textAlignment w:val="center"/>
+              <w:rPr>
+                <w:rFonts w:hint="default" w:ascii="Calibri" w:hAnsi="Calibri" w:cs="Calibri"/>
+                <w:i w:val="0"/>
+                <w:iCs w:val="0"/>
+                <w:color w:val="000000"/>
+                <w:sz w:val="22"/>
+                <w:szCs w:val="22"/>
+                <w:u w:val="none"/>
+              </w:rPr>
+            </w:pPr>
+            <w:r>
+              <w:rPr>
+                <w:rFonts w:hint="default" w:ascii="Calibri" w:hAnsi="Calibri" w:eastAsia="SimSun" w:cs="Calibri"/>
+                <w:i w:val="0"/>
+                <w:iCs w:val="0"/>
+                <w:color w:val="000000"/>
+                <w:kern w:val="0"/>
+                <w:sz w:val="22"/>
+                <w:szCs w:val="22"/>
+                <w:u w:val="none"/>
+                <w:lang w:val="en-US" w:eastAsia="zh-CN" w:bidi="ar"/>
+              </w:rPr>
               <w:t>20</w:t>
             </w:r>
           </w:p>
         </w:tc>
         <w:tc>
           <w:tcPr>
-            <w:tcW w:w="0" w:type="auto"/>
+            <w:tcW w:w="1280" w:type="dxa"/>
             <w:tcBorders>
               <w:top w:val="nil"/>
               <w:left w:val="nil"/>
@@ -1007,27 +802,28 @@
                 <w:sz w:val="22"/>
                 <w:szCs w:val="22"/>
                 <w:u w:val="none"/>
-              </w:rPr>
-            </w:pPr>
-            <w:r>
-              <w:rPr>
-                <w:rFonts w:hint="default" w:ascii="Calibri" w:hAnsi="Calibri" w:eastAsia="SimSun" w:cs="Calibri"/>
-                <w:i w:val="0"/>
-                <w:iCs w:val="0"/>
-                <w:color w:val="000000"/>
-                <w:kern w:val="0"/>
-                <w:sz w:val="22"/>
-                <w:szCs w:val="22"/>
-                <w:u w:val="none"/>
-                <w:lang w:val="en-US" w:eastAsia="zh-CN" w:bidi="ar"/>
-              </w:rPr>
-              <w:t>0</w:t>
-            </w:r>
-          </w:p>
-        </w:tc>
-        <w:tc>
-          <w:tcPr>
-            <w:tcW w:w="0" w:type="auto"/>
+                <w:lang w:val="en-IN"/>
+              </w:rPr>
+            </w:pPr>
+            <w:r>
+              <w:rPr>
+                <w:rFonts w:hint="default" w:ascii="Calibri" w:hAnsi="Calibri" w:eastAsia="SimSun" w:cs="Calibri"/>
+                <w:i w:val="0"/>
+                <w:iCs w:val="0"/>
+                <w:color w:val="000000"/>
+                <w:kern w:val="0"/>
+                <w:sz w:val="22"/>
+                <w:szCs w:val="22"/>
+                <w:u w:val="none"/>
+                <w:lang w:val="en-IN" w:eastAsia="zh-CN" w:bidi="ar"/>
+              </w:rPr>
+              <w:t>20</w:t>
+            </w:r>
+          </w:p>
+        </w:tc>
+        <w:tc>
+          <w:tcPr>
+            <w:tcW w:w="1510" w:type="dxa"/>
             <w:tcBorders>
               <w:top w:val="nil"/>
               <w:left w:val="nil"/>
@@ -1066,10 +862,106 @@
                 <w:sz w:val="22"/>
                 <w:szCs w:val="22"/>
                 <w:u w:val="none"/>
-                <w:lang w:val="en-US" w:eastAsia="zh-CN" w:bidi="ar"/>
-              </w:rPr>
-              <w:t>150</w:t>
-            </w:r>
+                <w:lang w:val="en-IN" w:eastAsia="zh-CN" w:bidi="ar"/>
+              </w:rPr>
+              <w:t>-</w:t>
+            </w:r>
+            <w:r>
+              <w:rPr>
+                <w:rFonts w:hint="default" w:ascii="Calibri" w:hAnsi="Calibri" w:eastAsia="SimSun" w:cs="Calibri"/>
+                <w:i w:val="0"/>
+                <w:iCs w:val="0"/>
+                <w:color w:val="000000"/>
+                <w:kern w:val="0"/>
+                <w:sz w:val="22"/>
+                <w:szCs w:val="22"/>
+                <w:u w:val="none"/>
+                <w:lang w:val="en-US" w:eastAsia="zh-CN" w:bidi="ar"/>
+              </w:rPr>
+              <w:t>10</w:t>
+            </w:r>
+          </w:p>
+        </w:tc>
+        <w:tc>
+          <w:tcPr>
+            <w:tcW w:w="1100" w:type="dxa"/>
+            <w:tcBorders>
+              <w:top w:val="nil"/>
+              <w:left w:val="nil"/>
+              <w:bottom w:val="nil"/>
+              <w:right w:val="nil"/>
+            </w:tcBorders>
+            <w:shd w:val="clear" w:color="auto" w:fill="auto"/>
+            <w:noWrap/>
+            <w:vAlign w:val="center"/>
+          </w:tcPr>
+          <w:p>
+            <w:pPr>
+              <w:keepNext w:val="0"/>
+              <w:keepLines w:val="0"/>
+              <w:widowControl/>
+              <w:suppressLineNumbers w:val="0"/>
+              <w:jc w:val="right"/>
+              <w:textAlignment w:val="center"/>
+              <w:rPr>
+                <w:rFonts w:hint="default" w:ascii="Calibri" w:hAnsi="Calibri" w:cs="Calibri"/>
+                <w:i w:val="0"/>
+                <w:iCs w:val="0"/>
+                <w:color w:val="000000"/>
+                <w:sz w:val="22"/>
+                <w:szCs w:val="22"/>
+                <w:u w:val="none"/>
+              </w:rPr>
+            </w:pPr>
+            <w:r>
+              <w:rPr>
+                <w:rFonts w:hint="default" w:ascii="Calibri" w:hAnsi="Calibri" w:eastAsia="SimSun" w:cs="Calibri"/>
+                <w:i w:val="0"/>
+                <w:iCs w:val="0"/>
+                <w:color w:val="000000"/>
+                <w:kern w:val="0"/>
+                <w:sz w:val="22"/>
+                <w:szCs w:val="22"/>
+                <w:u w:val="none"/>
+                <w:lang w:val="en-US" w:eastAsia="zh-CN" w:bidi="ar"/>
+              </w:rPr>
+              <w:t>90</w:t>
+            </w:r>
+          </w:p>
+        </w:tc>
+        <w:tc>
+          <w:tcPr>
+            <w:tcW w:w="4890" w:type="dxa"/>
+            <w:tcBorders>
+              <w:top w:val="nil"/>
+              <w:left w:val="nil"/>
+              <w:bottom w:val="nil"/>
+              <w:right w:val="nil"/>
+            </w:tcBorders>
+            <w:shd w:val="clear" w:color="auto" w:fill="auto"/>
+            <w:noWrap/>
+            <w:vAlign w:val="center"/>
+          </w:tcPr>
+          <w:p>
+            <w:pPr>
+              <w:keepNext w:val="0"/>
+              <w:keepLines w:val="0"/>
+              <w:widowControl/>
+              <w:suppressLineNumbers w:val="0"/>
+              <w:jc w:val="right"/>
+              <w:textAlignment w:val="center"/>
+              <w:rPr>
+                <w:rFonts w:hint="default" w:ascii="Calibri" w:hAnsi="Calibri" w:eastAsia="SimSun" w:cs="Calibri"/>
+                <w:i w:val="0"/>
+                <w:iCs w:val="0"/>
+                <w:color w:val="000000"/>
+                <w:kern w:val="0"/>
+                <w:sz w:val="22"/>
+                <w:szCs w:val="22"/>
+                <w:u w:val="none"/>
+                <w:lang w:val="en-US" w:eastAsia="zh-CN" w:bidi="ar"/>
+              </w:rPr>
+            </w:pPr>
           </w:p>
         </w:tc>
       </w:tr>
@@ -1096,7 +988,7 @@
         </w:trPr>
         <w:tc>
           <w:tcPr>
-            <w:tcW w:w="0" w:type="auto"/>
+            <w:tcW w:w="1880" w:type="dxa"/>
             <w:tcBorders>
               <w:top w:val="nil"/>
               <w:left w:val="nil"/>
@@ -1137,13 +1029,13 @@
                 <w:u w:val="none"/>
                 <w:lang w:val="en-US" w:eastAsia="zh-CN" w:bidi="ar"/>
               </w:rPr>
-              <w:t>D</w:t>
-            </w:r>
-          </w:p>
-        </w:tc>
-        <w:tc>
-          <w:tcPr>
-            <w:tcW w:w="0" w:type="auto"/>
+              <w:t>C</w:t>
+            </w:r>
+          </w:p>
+        </w:tc>
+        <w:tc>
+          <w:tcPr>
+            <w:tcW w:w="2270" w:type="dxa"/>
             <w:tcBorders>
               <w:top w:val="nil"/>
               <w:left w:val="nil"/>
@@ -1190,7 +1082,7 @@
         </w:tc>
         <w:tc>
           <w:tcPr>
-            <w:tcW w:w="0" w:type="auto"/>
+            <w:tcW w:w="1280" w:type="dxa"/>
             <w:tcBorders>
               <w:top w:val="nil"/>
               <w:left w:val="nil"/>
@@ -1217,27 +1109,28 @@
                 <w:sz w:val="22"/>
                 <w:szCs w:val="22"/>
                 <w:u w:val="none"/>
-              </w:rPr>
-            </w:pPr>
-            <w:r>
-              <w:rPr>
-                <w:rFonts w:hint="default" w:ascii="Calibri" w:hAnsi="Calibri" w:eastAsia="SimSun" w:cs="Calibri"/>
-                <w:i w:val="0"/>
-                <w:iCs w:val="0"/>
-                <w:color w:val="000000"/>
-                <w:kern w:val="0"/>
-                <w:sz w:val="22"/>
-                <w:szCs w:val="22"/>
-                <w:u w:val="none"/>
-                <w:lang w:val="en-US" w:eastAsia="zh-CN" w:bidi="ar"/>
-              </w:rPr>
-              <w:t>20</w:t>
-            </w:r>
-          </w:p>
-        </w:tc>
-        <w:tc>
-          <w:tcPr>
-            <w:tcW w:w="0" w:type="auto"/>
+                <w:lang w:val="en-IN"/>
+              </w:rPr>
+            </w:pPr>
+            <w:r>
+              <w:rPr>
+                <w:rFonts w:hint="default" w:ascii="Calibri" w:hAnsi="Calibri" w:eastAsia="SimSun" w:cs="Calibri"/>
+                <w:i w:val="0"/>
+                <w:iCs w:val="0"/>
+                <w:color w:val="000000"/>
+                <w:kern w:val="0"/>
+                <w:sz w:val="22"/>
+                <w:szCs w:val="22"/>
+                <w:u w:val="none"/>
+                <w:lang w:val="en-IN" w:eastAsia="zh-CN" w:bidi="ar"/>
+              </w:rPr>
+              <w:t>30</w:t>
+            </w:r>
+          </w:p>
+        </w:tc>
+        <w:tc>
+          <w:tcPr>
+            <w:tcW w:w="1510" w:type="dxa"/>
             <w:tcBorders>
               <w:top w:val="nil"/>
               <w:left w:val="nil"/>
@@ -1284,7 +1177,7 @@
         </w:tc>
         <w:tc>
           <w:tcPr>
-            <w:tcW w:w="0" w:type="auto"/>
+            <w:tcW w:w="1100" w:type="dxa"/>
             <w:tcBorders>
               <w:top w:val="nil"/>
               <w:left w:val="nil"/>
@@ -1325,8 +1218,43 @@
                 <w:u w:val="none"/>
                 <w:lang w:val="en-US" w:eastAsia="zh-CN" w:bidi="ar"/>
               </w:rPr>
-              <w:t>70</w:t>
-            </w:r>
+              <w:t>150</w:t>
+            </w:r>
+          </w:p>
+        </w:tc>
+        <w:tc>
+          <w:tcPr>
+            <w:tcW w:w="4890" w:type="dxa"/>
+            <w:tcBorders>
+              <w:top w:val="nil"/>
+              <w:left w:val="nil"/>
+              <w:bottom w:val="nil"/>
+              <w:right w:val="nil"/>
+            </w:tcBorders>
+            <w:shd w:val="clear" w:color="auto" w:fill="auto"/>
+            <w:noWrap/>
+            <w:vAlign w:val="center"/>
+          </w:tcPr>
+          <w:p>
+            <w:pPr>
+              <w:keepNext w:val="0"/>
+              <w:keepLines w:val="0"/>
+              <w:widowControl/>
+              <w:suppressLineNumbers w:val="0"/>
+              <w:jc w:val="right"/>
+              <w:textAlignment w:val="center"/>
+              <w:rPr>
+                <w:rFonts w:hint="default" w:ascii="Calibri" w:hAnsi="Calibri" w:eastAsia="SimSun" w:cs="Calibri"/>
+                <w:i w:val="0"/>
+                <w:iCs w:val="0"/>
+                <w:color w:val="000000"/>
+                <w:kern w:val="0"/>
+                <w:sz w:val="22"/>
+                <w:szCs w:val="22"/>
+                <w:u w:val="none"/>
+                <w:lang w:val="en-US" w:eastAsia="zh-CN" w:bidi="ar"/>
+              </w:rPr>
+            </w:pPr>
           </w:p>
         </w:tc>
       </w:tr>
@@ -1353,7 +1281,7 @@
         </w:trPr>
         <w:tc>
           <w:tcPr>
-            <w:tcW w:w="0" w:type="auto"/>
+            <w:tcW w:w="1880" w:type="dxa"/>
             <w:tcBorders>
               <w:top w:val="nil"/>
               <w:left w:val="nil"/>
@@ -1394,13 +1322,13 @@
                 <w:u w:val="none"/>
                 <w:lang w:val="en-US" w:eastAsia="zh-CN" w:bidi="ar"/>
               </w:rPr>
-              <w:t>E</w:t>
-            </w:r>
-          </w:p>
-        </w:tc>
-        <w:tc>
-          <w:tcPr>
-            <w:tcW w:w="0" w:type="auto"/>
+              <w:t>D</w:t>
+            </w:r>
+          </w:p>
+        </w:tc>
+        <w:tc>
+          <w:tcPr>
+            <w:tcW w:w="2270" w:type="dxa"/>
             <w:tcBorders>
               <w:top w:val="nil"/>
               <w:left w:val="nil"/>
@@ -1447,7 +1375,7 @@
         </w:tc>
         <w:tc>
           <w:tcPr>
-            <w:tcW w:w="0" w:type="auto"/>
+            <w:tcW w:w="1280" w:type="dxa"/>
             <w:tcBorders>
               <w:top w:val="nil"/>
               <w:left w:val="nil"/>
@@ -1494,7 +1422,7 @@
         </w:tc>
         <w:tc>
           <w:tcPr>
-            <w:tcW w:w="0" w:type="auto"/>
+            <w:tcW w:w="1510" w:type="dxa"/>
             <w:tcBorders>
               <w:top w:val="nil"/>
               <w:left w:val="nil"/>
@@ -1541,7 +1469,7 @@
         </w:tc>
         <w:tc>
           <w:tcPr>
-            <w:tcW w:w="0" w:type="auto"/>
+            <w:tcW w:w="1100" w:type="dxa"/>
             <w:tcBorders>
               <w:top w:val="nil"/>
               <w:left w:val="nil"/>
@@ -1582,8 +1510,43 @@
                 <w:u w:val="none"/>
                 <w:lang w:val="en-US" w:eastAsia="zh-CN" w:bidi="ar"/>
               </w:rPr>
-              <w:t>80</w:t>
-            </w:r>
+              <w:t>70</w:t>
+            </w:r>
+          </w:p>
+        </w:tc>
+        <w:tc>
+          <w:tcPr>
+            <w:tcW w:w="4890" w:type="dxa"/>
+            <w:tcBorders>
+              <w:top w:val="nil"/>
+              <w:left w:val="nil"/>
+              <w:bottom w:val="nil"/>
+              <w:right w:val="nil"/>
+            </w:tcBorders>
+            <w:shd w:val="clear" w:color="auto" w:fill="auto"/>
+            <w:noWrap/>
+            <w:vAlign w:val="center"/>
+          </w:tcPr>
+          <w:p>
+            <w:pPr>
+              <w:keepNext w:val="0"/>
+              <w:keepLines w:val="0"/>
+              <w:widowControl/>
+              <w:suppressLineNumbers w:val="0"/>
+              <w:jc w:val="right"/>
+              <w:textAlignment w:val="center"/>
+              <w:rPr>
+                <w:rFonts w:hint="default" w:ascii="Calibri" w:hAnsi="Calibri" w:eastAsia="SimSun" w:cs="Calibri"/>
+                <w:i w:val="0"/>
+                <w:iCs w:val="0"/>
+                <w:color w:val="000000"/>
+                <w:kern w:val="0"/>
+                <w:sz w:val="22"/>
+                <w:szCs w:val="22"/>
+                <w:u w:val="none"/>
+                <w:lang w:val="en-US" w:eastAsia="zh-CN" w:bidi="ar"/>
+              </w:rPr>
+            </w:pPr>
           </w:p>
         </w:tc>
       </w:tr>
@@ -1597,6 +1560,7 @@
             <w:insideH w:val="none" w:color="auto" w:sz="0" w:space="0"/>
             <w:insideV w:val="none" w:color="auto" w:sz="0" w:space="0"/>
           </w:tblBorders>
+          <w:shd w:val="clear" w:color="auto" w:fill="auto"/>
           <w:tblCellMar>
             <w:top w:w="0" w:type="dxa"/>
             <w:left w:w="108" w:type="dxa"/>
@@ -1609,7 +1573,7 @@
         </w:trPr>
         <w:tc>
           <w:tcPr>
-            <w:tcW w:w="0" w:type="auto"/>
+            <w:tcW w:w="1880" w:type="dxa"/>
             <w:tcBorders>
               <w:top w:val="nil"/>
               <w:left w:val="nil"/>
@@ -1629,127 +1593,454 @@
               <w:jc w:val="left"/>
               <w:textAlignment w:val="center"/>
               <w:rPr>
-                <w:rFonts w:hint="default" w:ascii="Calibri" w:hAnsi="Calibri" w:eastAsia="SimSun" w:cs="Calibri"/>
-                <w:i w:val="0"/>
-                <w:iCs w:val="0"/>
-                <w:color w:val="000000"/>
-                <w:kern w:val="0"/>
-                <w:sz w:val="22"/>
-                <w:szCs w:val="22"/>
-                <w:u w:val="none"/>
-                <w:lang w:val="en-US" w:eastAsia="zh-CN" w:bidi="ar"/>
-              </w:rPr>
-            </w:pPr>
-          </w:p>
-        </w:tc>
-        <w:tc>
-          <w:tcPr>
-            <w:tcW w:w="0" w:type="auto"/>
-            <w:tcBorders>
-              <w:top w:val="nil"/>
-              <w:left w:val="nil"/>
-              <w:bottom w:val="nil"/>
-              <w:right w:val="nil"/>
-            </w:tcBorders>
-            <w:shd w:val="clear" w:color="auto" w:fill="auto"/>
-            <w:noWrap/>
-            <w:vAlign w:val="center"/>
-          </w:tcPr>
-          <w:p>
-            <w:pPr>
-              <w:keepNext w:val="0"/>
-              <w:keepLines w:val="0"/>
-              <w:widowControl/>
-              <w:suppressLineNumbers w:val="0"/>
-              <w:jc w:val="right"/>
-              <w:textAlignment w:val="center"/>
-              <w:rPr>
-                <w:rFonts w:hint="default" w:ascii="Calibri" w:hAnsi="Calibri" w:eastAsia="SimSun" w:cs="Calibri"/>
-                <w:i w:val="0"/>
-                <w:iCs w:val="0"/>
-                <w:color w:val="000000"/>
-                <w:kern w:val="0"/>
-                <w:sz w:val="22"/>
-                <w:szCs w:val="22"/>
-                <w:u w:val="none"/>
-                <w:lang w:val="en-US" w:eastAsia="zh-CN" w:bidi="ar"/>
-              </w:rPr>
-            </w:pPr>
-          </w:p>
-        </w:tc>
-        <w:tc>
-          <w:tcPr>
-            <w:tcW w:w="0" w:type="auto"/>
-            <w:tcBorders>
-              <w:top w:val="nil"/>
-              <w:left w:val="nil"/>
-              <w:bottom w:val="nil"/>
-              <w:right w:val="nil"/>
-            </w:tcBorders>
-            <w:shd w:val="clear" w:color="auto" w:fill="auto"/>
-            <w:noWrap/>
-            <w:vAlign w:val="center"/>
-          </w:tcPr>
-          <w:p>
-            <w:pPr>
-              <w:keepNext w:val="0"/>
-              <w:keepLines w:val="0"/>
-              <w:widowControl/>
-              <w:suppressLineNumbers w:val="0"/>
-              <w:jc w:val="right"/>
-              <w:textAlignment w:val="center"/>
-              <w:rPr>
-                <w:rFonts w:hint="default" w:ascii="Calibri" w:hAnsi="Calibri" w:eastAsia="SimSun" w:cs="Calibri"/>
-                <w:i w:val="0"/>
-                <w:iCs w:val="0"/>
-                <w:color w:val="000000"/>
-                <w:kern w:val="0"/>
-                <w:sz w:val="22"/>
-                <w:szCs w:val="22"/>
-                <w:u w:val="none"/>
-                <w:lang w:val="en-US" w:eastAsia="zh-CN" w:bidi="ar"/>
-              </w:rPr>
-            </w:pPr>
-          </w:p>
-        </w:tc>
-        <w:tc>
-          <w:tcPr>
-            <w:tcW w:w="0" w:type="auto"/>
-            <w:tcBorders>
-              <w:top w:val="nil"/>
-              <w:left w:val="nil"/>
-              <w:bottom w:val="nil"/>
-              <w:right w:val="nil"/>
-            </w:tcBorders>
-            <w:shd w:val="clear" w:color="auto" w:fill="auto"/>
-            <w:noWrap/>
-            <w:vAlign w:val="center"/>
-          </w:tcPr>
-          <w:p>
-            <w:pPr>
-              <w:keepNext w:val="0"/>
-              <w:keepLines w:val="0"/>
-              <w:widowControl/>
-              <w:suppressLineNumbers w:val="0"/>
-              <w:jc w:val="right"/>
-              <w:textAlignment w:val="center"/>
-              <w:rPr>
-                <w:rFonts w:hint="default" w:ascii="Calibri" w:hAnsi="Calibri" w:eastAsia="SimSun" w:cs="Calibri"/>
-                <w:i w:val="0"/>
-                <w:iCs w:val="0"/>
-                <w:color w:val="000000"/>
-                <w:kern w:val="0"/>
-                <w:sz w:val="22"/>
-                <w:szCs w:val="22"/>
-                <w:u w:val="none"/>
-                <w:lang w:val="en-US" w:eastAsia="zh-CN" w:bidi="ar"/>
-              </w:rPr>
-            </w:pPr>
-          </w:p>
-        </w:tc>
-        <w:tc>
-          <w:tcPr>
-            <w:tcW w:w="0" w:type="auto"/>
+                <w:rFonts w:hint="default" w:ascii="Calibri" w:hAnsi="Calibri" w:cs="Calibri"/>
+                <w:i w:val="0"/>
+                <w:iCs w:val="0"/>
+                <w:color w:val="000000"/>
+                <w:sz w:val="22"/>
+                <w:szCs w:val="22"/>
+                <w:u w:val="none"/>
+              </w:rPr>
+            </w:pPr>
+            <w:r>
+              <w:rPr>
+                <w:rFonts w:hint="default" w:ascii="Calibri" w:hAnsi="Calibri" w:eastAsia="SimSun" w:cs="Calibri"/>
+                <w:i w:val="0"/>
+                <w:iCs w:val="0"/>
+                <w:color w:val="000000"/>
+                <w:kern w:val="0"/>
+                <w:sz w:val="22"/>
+                <w:szCs w:val="22"/>
+                <w:u w:val="none"/>
+                <w:lang w:val="en-US" w:eastAsia="zh-CN" w:bidi="ar"/>
+              </w:rPr>
+              <w:t>E</w:t>
+            </w:r>
+          </w:p>
+        </w:tc>
+        <w:tc>
+          <w:tcPr>
+            <w:tcW w:w="2270" w:type="dxa"/>
+            <w:tcBorders>
+              <w:top w:val="nil"/>
+              <w:left w:val="nil"/>
+              <w:bottom w:val="nil"/>
+              <w:right w:val="nil"/>
+            </w:tcBorders>
+            <w:shd w:val="clear" w:color="auto" w:fill="auto"/>
+            <w:noWrap/>
+            <w:vAlign w:val="center"/>
+          </w:tcPr>
+          <w:p>
+            <w:pPr>
+              <w:keepNext w:val="0"/>
+              <w:keepLines w:val="0"/>
+              <w:widowControl/>
+              <w:suppressLineNumbers w:val="0"/>
+              <w:jc w:val="right"/>
+              <w:textAlignment w:val="center"/>
+              <w:rPr>
+                <w:rFonts w:hint="default" w:ascii="Calibri" w:hAnsi="Calibri" w:cs="Calibri"/>
+                <w:i w:val="0"/>
+                <w:iCs w:val="0"/>
+                <w:color w:val="000000"/>
+                <w:sz w:val="22"/>
+                <w:szCs w:val="22"/>
+                <w:u w:val="none"/>
+              </w:rPr>
+            </w:pPr>
+            <w:r>
+              <w:rPr>
+                <w:rFonts w:hint="default" w:ascii="Calibri" w:hAnsi="Calibri" w:eastAsia="SimSun" w:cs="Calibri"/>
+                <w:i w:val="0"/>
+                <w:iCs w:val="0"/>
+                <w:color w:val="000000"/>
+                <w:kern w:val="0"/>
+                <w:sz w:val="22"/>
+                <w:szCs w:val="22"/>
+                <w:u w:val="none"/>
+                <w:lang w:val="en-US" w:eastAsia="zh-CN" w:bidi="ar"/>
+              </w:rPr>
+              <w:t>20</w:t>
+            </w:r>
+          </w:p>
+        </w:tc>
+        <w:tc>
+          <w:tcPr>
+            <w:tcW w:w="1280" w:type="dxa"/>
+            <w:tcBorders>
+              <w:top w:val="nil"/>
+              <w:left w:val="nil"/>
+              <w:bottom w:val="nil"/>
+              <w:right w:val="nil"/>
+            </w:tcBorders>
+            <w:shd w:val="clear" w:color="auto" w:fill="auto"/>
+            <w:noWrap/>
+            <w:vAlign w:val="center"/>
+          </w:tcPr>
+          <w:p>
+            <w:pPr>
+              <w:keepNext w:val="0"/>
+              <w:keepLines w:val="0"/>
+              <w:widowControl/>
+              <w:suppressLineNumbers w:val="0"/>
+              <w:jc w:val="right"/>
+              <w:textAlignment w:val="center"/>
+              <w:rPr>
+                <w:rFonts w:hint="default" w:ascii="Calibri" w:hAnsi="Calibri" w:cs="Calibri"/>
+                <w:i w:val="0"/>
+                <w:iCs w:val="0"/>
+                <w:color w:val="000000"/>
+                <w:sz w:val="22"/>
+                <w:szCs w:val="22"/>
+                <w:u w:val="none"/>
+              </w:rPr>
+            </w:pPr>
+            <w:r>
+              <w:rPr>
+                <w:rFonts w:hint="default" w:ascii="Calibri" w:hAnsi="Calibri" w:eastAsia="SimSun" w:cs="Calibri"/>
+                <w:i w:val="0"/>
+                <w:iCs w:val="0"/>
+                <w:color w:val="000000"/>
+                <w:kern w:val="0"/>
+                <w:sz w:val="22"/>
+                <w:szCs w:val="22"/>
+                <w:u w:val="none"/>
+                <w:lang w:val="en-US" w:eastAsia="zh-CN" w:bidi="ar"/>
+              </w:rPr>
+              <w:t>20</w:t>
+            </w:r>
+          </w:p>
+        </w:tc>
+        <w:tc>
+          <w:tcPr>
+            <w:tcW w:w="1510" w:type="dxa"/>
+            <w:tcBorders>
+              <w:top w:val="nil"/>
+              <w:left w:val="nil"/>
+              <w:bottom w:val="nil"/>
+              <w:right w:val="nil"/>
+            </w:tcBorders>
+            <w:shd w:val="clear" w:color="auto" w:fill="auto"/>
+            <w:noWrap/>
+            <w:vAlign w:val="center"/>
+          </w:tcPr>
+          <w:p>
+            <w:pPr>
+              <w:keepNext w:val="0"/>
+              <w:keepLines w:val="0"/>
+              <w:widowControl/>
+              <w:suppressLineNumbers w:val="0"/>
+              <w:jc w:val="right"/>
+              <w:textAlignment w:val="center"/>
+              <w:rPr>
+                <w:rFonts w:hint="default" w:ascii="Calibri" w:hAnsi="Calibri" w:cs="Calibri"/>
+                <w:i w:val="0"/>
+                <w:iCs w:val="0"/>
+                <w:color w:val="000000"/>
+                <w:sz w:val="22"/>
+                <w:szCs w:val="22"/>
+                <w:u w:val="none"/>
+              </w:rPr>
+            </w:pPr>
+            <w:r>
+              <w:rPr>
+                <w:rFonts w:hint="default" w:ascii="Calibri" w:hAnsi="Calibri" w:eastAsia="SimSun" w:cs="Calibri"/>
+                <w:i w:val="0"/>
+                <w:iCs w:val="0"/>
+                <w:color w:val="000000"/>
+                <w:kern w:val="0"/>
+                <w:sz w:val="22"/>
+                <w:szCs w:val="22"/>
+                <w:u w:val="none"/>
+                <w:lang w:val="en-US" w:eastAsia="zh-CN" w:bidi="ar"/>
+              </w:rPr>
+              <w:t>0</w:t>
+            </w:r>
+          </w:p>
+        </w:tc>
+        <w:tc>
+          <w:tcPr>
+            <w:tcW w:w="1100" w:type="dxa"/>
+            <w:tcBorders>
+              <w:top w:val="nil"/>
+              <w:left w:val="nil"/>
+              <w:bottom w:val="nil"/>
+              <w:right w:val="nil"/>
+            </w:tcBorders>
+            <w:shd w:val="clear" w:color="auto" w:fill="auto"/>
+            <w:noWrap/>
+            <w:vAlign w:val="center"/>
+          </w:tcPr>
+          <w:p>
+            <w:pPr>
+              <w:keepNext w:val="0"/>
+              <w:keepLines w:val="0"/>
+              <w:widowControl/>
+              <w:suppressLineNumbers w:val="0"/>
+              <w:jc w:val="right"/>
+              <w:textAlignment w:val="center"/>
+              <w:rPr>
+                <w:rFonts w:hint="default" w:ascii="Calibri" w:hAnsi="Calibri" w:cs="Calibri"/>
+                <w:i w:val="0"/>
+                <w:iCs w:val="0"/>
+                <w:color w:val="000000"/>
+                <w:sz w:val="22"/>
+                <w:szCs w:val="22"/>
+                <w:u w:val="none"/>
+              </w:rPr>
+            </w:pPr>
+            <w:r>
+              <w:rPr>
+                <w:rFonts w:hint="default" w:ascii="Calibri" w:hAnsi="Calibri" w:eastAsia="SimSun" w:cs="Calibri"/>
+                <w:i w:val="0"/>
+                <w:iCs w:val="0"/>
+                <w:color w:val="000000"/>
+                <w:kern w:val="0"/>
+                <w:sz w:val="22"/>
+                <w:szCs w:val="22"/>
+                <w:u w:val="none"/>
+                <w:lang w:val="en-US" w:eastAsia="zh-CN" w:bidi="ar"/>
+              </w:rPr>
+              <w:t>80</w:t>
+            </w:r>
+          </w:p>
+        </w:tc>
+        <w:tc>
+          <w:tcPr>
+            <w:tcW w:w="4890" w:type="dxa"/>
+            <w:tcBorders>
+              <w:top w:val="nil"/>
+              <w:left w:val="nil"/>
+              <w:bottom w:val="nil"/>
+              <w:right w:val="nil"/>
+            </w:tcBorders>
+            <w:shd w:val="clear" w:color="auto" w:fill="auto"/>
+            <w:noWrap/>
+            <w:vAlign w:val="center"/>
+          </w:tcPr>
+          <w:p>
+            <w:pPr>
+              <w:keepNext w:val="0"/>
+              <w:keepLines w:val="0"/>
+              <w:widowControl/>
+              <w:suppressLineNumbers w:val="0"/>
+              <w:jc w:val="right"/>
+              <w:textAlignment w:val="center"/>
+              <w:rPr>
+                <w:rFonts w:hint="default" w:ascii="Calibri" w:hAnsi="Calibri" w:eastAsia="SimSun" w:cs="Calibri"/>
+                <w:i w:val="0"/>
+                <w:iCs w:val="0"/>
+                <w:color w:val="000000"/>
+                <w:kern w:val="0"/>
+                <w:sz w:val="22"/>
+                <w:szCs w:val="22"/>
+                <w:u w:val="none"/>
+                <w:lang w:val="en-US" w:eastAsia="zh-CN" w:bidi="ar"/>
+              </w:rPr>
+            </w:pPr>
+          </w:p>
+        </w:tc>
+      </w:tr>
+      <w:tr>
+        <w:tblPrEx>
+          <w:tblBorders>
+            <w:top w:val="none" w:color="auto" w:sz="0" w:space="0"/>
+            <w:left w:val="none" w:color="auto" w:sz="0" w:space="0"/>
+            <w:bottom w:val="none" w:color="auto" w:sz="0" w:space="0"/>
+            <w:right w:val="none" w:color="auto" w:sz="0" w:space="0"/>
+            <w:insideH w:val="none" w:color="auto" w:sz="0" w:space="0"/>
+            <w:insideV w:val="none" w:color="auto" w:sz="0" w:space="0"/>
+          </w:tblBorders>
+          <w:shd w:val="clear" w:color="auto" w:fill="auto"/>
+          <w:tblCellMar>
+            <w:top w:w="0" w:type="dxa"/>
+            <w:left w:w="108" w:type="dxa"/>
+            <w:bottom w:w="0" w:type="dxa"/>
+            <w:right w:w="108" w:type="dxa"/>
+          </w:tblCellMar>
+        </w:tblPrEx>
+        <w:trPr>
+          <w:trHeight w:val="290" w:hRule="atLeast"/>
+        </w:trPr>
+        <w:tc>
+          <w:tcPr>
+            <w:tcW w:w="1880" w:type="dxa"/>
+            <w:tcBorders>
+              <w:top w:val="nil"/>
+              <w:left w:val="nil"/>
+              <w:bottom w:val="nil"/>
+              <w:right w:val="nil"/>
+            </w:tcBorders>
+            <w:shd w:val="clear" w:color="auto" w:fill="auto"/>
+            <w:noWrap/>
+            <w:vAlign w:val="center"/>
+          </w:tcPr>
+          <w:p>
+            <w:pPr>
+              <w:keepNext w:val="0"/>
+              <w:keepLines w:val="0"/>
+              <w:widowControl/>
+              <w:suppressLineNumbers w:val="0"/>
+              <w:jc w:val="left"/>
+              <w:textAlignment w:val="center"/>
+              <w:rPr>
+                <w:rFonts w:hint="default" w:ascii="Calibri" w:hAnsi="Calibri" w:eastAsia="SimSun" w:cs="Calibri"/>
+                <w:i w:val="0"/>
+                <w:iCs w:val="0"/>
+                <w:color w:val="000000"/>
+                <w:kern w:val="0"/>
+                <w:sz w:val="22"/>
+                <w:szCs w:val="22"/>
+                <w:u w:val="none"/>
+                <w:lang w:val="en-US" w:eastAsia="zh-CN" w:bidi="ar"/>
+              </w:rPr>
+            </w:pPr>
+          </w:p>
+        </w:tc>
+        <w:tc>
+          <w:tcPr>
+            <w:tcW w:w="2270" w:type="dxa"/>
+            <w:tcBorders>
+              <w:top w:val="nil"/>
+              <w:left w:val="nil"/>
+              <w:bottom w:val="nil"/>
+              <w:right w:val="nil"/>
+            </w:tcBorders>
+            <w:shd w:val="clear" w:color="auto" w:fill="auto"/>
+            <w:noWrap/>
+            <w:vAlign w:val="center"/>
+          </w:tcPr>
+          <w:p>
+            <w:pPr>
+              <w:keepNext w:val="0"/>
+              <w:keepLines w:val="0"/>
+              <w:widowControl/>
+              <w:suppressLineNumbers w:val="0"/>
+              <w:jc w:val="right"/>
+              <w:textAlignment w:val="center"/>
+              <w:rPr>
+                <w:rFonts w:hint="default" w:ascii="Calibri" w:hAnsi="Calibri" w:eastAsia="SimSun" w:cs="Calibri"/>
+                <w:i w:val="0"/>
+                <w:iCs w:val="0"/>
+                <w:color w:val="000000"/>
+                <w:kern w:val="0"/>
+                <w:sz w:val="22"/>
+                <w:szCs w:val="22"/>
+                <w:u w:val="none"/>
+                <w:lang w:val="en-US" w:eastAsia="zh-CN" w:bidi="ar"/>
+              </w:rPr>
+            </w:pPr>
+          </w:p>
+        </w:tc>
+        <w:tc>
+          <w:tcPr>
+            <w:tcW w:w="1280" w:type="dxa"/>
+            <w:tcBorders>
+              <w:top w:val="nil"/>
+              <w:left w:val="nil"/>
+              <w:bottom w:val="nil"/>
+              <w:right w:val="nil"/>
+            </w:tcBorders>
+            <w:shd w:val="clear" w:color="auto" w:fill="auto"/>
+            <w:noWrap/>
+            <w:vAlign w:val="center"/>
+          </w:tcPr>
+          <w:p>
+            <w:pPr>
+              <w:keepNext w:val="0"/>
+              <w:keepLines w:val="0"/>
+              <w:widowControl/>
+              <w:suppressLineNumbers w:val="0"/>
+              <w:jc w:val="right"/>
+              <w:textAlignment w:val="center"/>
+              <w:rPr>
+                <w:rFonts w:hint="default" w:ascii="Calibri" w:hAnsi="Calibri" w:eastAsia="SimSun" w:cs="Calibri"/>
+                <w:i w:val="0"/>
+                <w:iCs w:val="0"/>
+                <w:color w:val="000000"/>
+                <w:kern w:val="0"/>
+                <w:sz w:val="22"/>
+                <w:szCs w:val="22"/>
+                <w:u w:val="none"/>
+                <w:lang w:val="en-US" w:eastAsia="zh-CN" w:bidi="ar"/>
+              </w:rPr>
+            </w:pPr>
+          </w:p>
+        </w:tc>
+        <w:tc>
+          <w:tcPr>
+            <w:tcW w:w="1510" w:type="dxa"/>
+            <w:tcBorders>
+              <w:top w:val="nil"/>
+              <w:left w:val="nil"/>
+              <w:bottom w:val="nil"/>
+              <w:right w:val="nil"/>
+            </w:tcBorders>
+            <w:shd w:val="clear" w:color="auto" w:fill="auto"/>
+            <w:noWrap/>
+            <w:vAlign w:val="center"/>
+          </w:tcPr>
+          <w:p>
+            <w:pPr>
+              <w:keepNext w:val="0"/>
+              <w:keepLines w:val="0"/>
+              <w:widowControl/>
+              <w:suppressLineNumbers w:val="0"/>
+              <w:jc w:val="right"/>
+              <w:textAlignment w:val="center"/>
+              <w:rPr>
+                <w:rFonts w:hint="default" w:ascii="Calibri" w:hAnsi="Calibri" w:eastAsia="SimSun" w:cs="Calibri"/>
+                <w:i w:val="0"/>
+                <w:iCs w:val="0"/>
+                <w:color w:val="000000"/>
+                <w:kern w:val="0"/>
+                <w:sz w:val="22"/>
+                <w:szCs w:val="22"/>
+                <w:u w:val="none"/>
+                <w:lang w:val="en-US" w:eastAsia="zh-CN" w:bidi="ar"/>
+              </w:rPr>
+            </w:pPr>
+          </w:p>
+        </w:tc>
+        <w:tc>
+          <w:tcPr>
+            <w:tcW w:w="1100" w:type="dxa"/>
+            <w:tcBorders>
+              <w:top w:val="nil"/>
+              <w:left w:val="nil"/>
+              <w:bottom w:val="nil"/>
+              <w:right w:val="nil"/>
+            </w:tcBorders>
+            <w:shd w:val="clear" w:color="auto" w:fill="auto"/>
+            <w:noWrap/>
+            <w:vAlign w:val="center"/>
+          </w:tcPr>
+          <w:p>
+            <w:pPr>
+              <w:keepNext w:val="0"/>
+              <w:keepLines w:val="0"/>
+              <w:widowControl/>
+              <w:suppressLineNumbers w:val="0"/>
+              <w:jc w:val="right"/>
+              <w:textAlignment w:val="center"/>
+              <w:rPr>
+                <w:rFonts w:hint="default" w:ascii="Calibri" w:hAnsi="Calibri" w:eastAsia="SimSun" w:cs="Calibri"/>
+                <w:i w:val="0"/>
+                <w:iCs w:val="0"/>
+                <w:color w:val="000000"/>
+                <w:kern w:val="0"/>
+                <w:sz w:val="22"/>
+                <w:szCs w:val="22"/>
+                <w:u w:val="none"/>
+                <w:lang w:val="en-US" w:eastAsia="zh-CN" w:bidi="ar"/>
+              </w:rPr>
+            </w:pPr>
+          </w:p>
+        </w:tc>
+        <w:tc>
+          <w:tcPr>
+            <w:tcW w:w="4890" w:type="dxa"/>
             <w:tcBorders>
               <w:top w:val="nil"/>
               <w:left w:val="nil"/>
@@ -1784,48 +2075,162 @@
         </w:tc>
       </w:tr>
     </w:tbl>
-    <w:p/>
     <w:p>
       <w:pPr>
         <w:rPr>
           <w:rFonts w:hint="default"/>
-          <w:lang w:val="en-IN"/>
         </w:rPr>
       </w:pPr>
       <w:r>
         <w:rPr>
           <w:rFonts w:hint="default"/>
-          <w:lang w:val="en-IN"/>
         </w:rPr>
-        <w:t>Account ABC holds these securities - A,B,C,D,E</w:t>
+        <w:t>Account ABC holds these securities -</w:t>
       </w:r>
       <w:r>
         <w:rPr>
           <w:rFonts w:hint="default"/>
           <w:lang w:val="en-IN"/>
         </w:rPr>
-        <w:br w:type="textWrapping"/>
+        <w:t xml:space="preserve">A,B,C,D,E </w:t>
       </w:r>
       <w:r>
         <w:rPr>
           <w:rFonts w:hint="default"/>
-          <w:lang w:val="en-IN"/>
         </w:rPr>
-        <w:t>Total Asset 100$</w:t>
+        <w:t xml:space="preserve"> with</w:t>
       </w:r>
+    </w:p>
+    <w:p>
+      <w:pPr>
+        <w:rPr>
+          <w:rFonts w:hint="default"/>
+        </w:rPr>
+      </w:pPr>
       <w:r>
         <w:rPr>
           <w:rFonts w:hint="default"/>
-          <w:lang w:val="en-IN"/>
         </w:rPr>
-        <w:br w:type="textWrapping"/>
+        <w:t>$100K in total asset</w:t>
       </w:r>
+    </w:p>
+    <w:p>
+      <w:pPr>
+        <w:rPr>
+          <w:rFonts w:hint="default"/>
+        </w:rPr>
+      </w:pPr>
       <w:r>
         <w:rPr>
           <w:rFonts w:hint="default"/>
-          <w:lang w:val="en-IN"/>
         </w:rPr>
-        <w:t>Target share percentage indicates what share percentage you should hold into your account</w:t>
+        <w:t>(100% is vested)</w:t>
+      </w:r>
+    </w:p>
+    <w:p>
+      <w:pPr>
+        <w:rPr>
+          <w:rFonts w:hint="default"/>
+        </w:rPr>
+      </w:pPr>
+      <w:bookmarkStart w:id="0" w:name="_GoBack"/>
+      <w:bookmarkEnd w:id="0"/>
+      <w:r>
+        <w:rPr>
+          <w:rFonts w:hint="default"/>
+        </w:rPr>
+        <w:t>Total Asset - $100,000</w:t>
+      </w:r>
+    </w:p>
+    <w:p>
+      <w:pPr>
+        <w:rPr>
+          <w:rFonts w:hint="default"/>
+        </w:rPr>
+      </w:pPr>
+      <w:r>
+        <w:rPr>
+          <w:rFonts w:hint="default"/>
+        </w:rPr>
+        <w:t>target% indicates what % of total assets, you should</w:t>
+      </w:r>
+    </w:p>
+    <w:p>
+      <w:pPr>
+        <w:rPr>
+          <w:rFonts w:hint="default"/>
+        </w:rPr>
+      </w:pPr>
+      <w:r>
+        <w:rPr>
+          <w:rFonts w:hint="default"/>
+        </w:rPr>
+        <w:t>hold in your acct</w:t>
+      </w:r>
+    </w:p>
+    <w:p>
+      <w:pPr>
+        <w:rPr>
+          <w:rFonts w:hint="default"/>
+        </w:rPr>
+      </w:pPr>
+      <w:r>
+        <w:rPr>
+          <w:rFonts w:hint="default"/>
+        </w:rPr>
+        <w:t>current% shows what % of total assets, you currently</w:t>
+      </w:r>
+    </w:p>
+    <w:p>
+      <w:pPr>
+        <w:rPr>
+          <w:rFonts w:hint="default"/>
+        </w:rPr>
+      </w:pPr>
+      <w:r>
+        <w:rPr>
+          <w:rFonts w:hint="default"/>
+        </w:rPr>
+        <w:t>have in your Acct</w:t>
+      </w:r>
+    </w:p>
+    <w:p>
+      <w:pPr>
+        <w:rPr>
+          <w:rFonts w:hint="default"/>
+        </w:rPr>
+      </w:pPr>
+      <w:r>
+        <w:rPr>
+          <w:rFonts w:hint="default"/>
+        </w:rPr>
+        <w:t>target Variance shows how much deviation you have, (-ve) var means you need to buy (+ve) var means</w:t>
+      </w:r>
+    </w:p>
+    <w:p>
+      <w:pPr>
+        <w:rPr>
+          <w:rFonts w:hint="default"/>
+        </w:rPr>
+      </w:pPr>
+      <w:r>
+        <w:rPr>
+          <w:rFonts w:hint="default"/>
+        </w:rPr>
+        <w:t>you need to sell</w:t>
+      </w:r>
+    </w:p>
+    <w:p>
+      <w:pPr>
+        <w:rPr>
+          <w:rFonts w:hint="default"/>
+        </w:rPr>
+      </w:pPr>
+      <w:r>
+        <w:rPr>
+          <w:rFonts w:hint="default"/>
+        </w:rPr>
+        <w:t>What do you have to do to get to</w:t>
       </w:r>
     </w:p>
     <w:p>
@@ -1838,55 +2243,9 @@
       <w:r>
         <w:rPr>
           <w:rFonts w:hint="default"/>
-          <w:lang w:val="en-IN"/>
         </w:rPr>
-        <w:t>Current share percentage indicates what share percentage you have into your account</w:t>
+        <w:t>zero target variance?</w:t>
       </w:r>
-      <w:r>
-        <w:rPr>
-          <w:rFonts w:hint="default"/>
-          <w:lang w:val="en-IN"/>
-        </w:rPr>
-        <w:br w:type="textWrapping"/>
-      </w:r>
-      <w:r>
-        <w:rPr>
-          <w:rFonts w:hint="default"/>
-          <w:lang w:val="en-IN"/>
-        </w:rPr>
-        <w:t>Deviation show how much deviation you have where  (-ve)var means you need to sell</w:t>
-      </w:r>
-      <w:r>
-        <w:rPr>
-          <w:rFonts w:hint="default"/>
-          <w:lang w:val="en-IN"/>
-        </w:rPr>
-        <w:br w:type="textWrapping"/>
-      </w:r>
-      <w:r>
-        <w:rPr>
-          <w:rFonts w:hint="default"/>
-          <w:lang w:val="en-IN"/>
-        </w:rPr>
-        <w:br w:type="textWrapping"/>
-      </w:r>
-      <w:r>
-        <w:rPr>
-          <w:rFonts w:hint="default"/>
-          <w:lang w:val="en-IN"/>
-        </w:rPr>
-        <w:t>The system needs to do to get zero target variance</w:t>
-      </w:r>
-      <w:bookmarkStart w:id="0" w:name="_GoBack"/>
-      <w:bookmarkEnd w:id="0"/>
-    </w:p>
-    <w:p>
-      <w:pPr>
-        <w:rPr>
-          <w:rFonts w:hint="default"/>
-          <w:lang w:val="en-IN"/>
-        </w:rPr>
-      </w:pPr>
     </w:p>
     <w:sectPr>
       <w:pgSz w:w="11906" w:h="16838"/>
@@ -2012,7 +2371,7 @@
     <w:lsdException w:unhideWhenUsed="0" w:uiPriority="0" w:semiHidden="0" w:name="HTML Sample"/>
     <w:lsdException w:unhideWhenUsed="0" w:uiPriority="0" w:semiHidden="0" w:name="HTML Typewriter"/>
     <w:lsdException w:unhideWhenUsed="0" w:uiPriority="0" w:semiHidden="0" w:name="HTML Variable"/>
-    <w:lsdException w:unhideWhenUsed="0" w:uiPriority="0" w:name="Normal Table"/>
+    <w:lsdException w:qFormat="1" w:unhideWhenUsed="0" w:uiPriority="0" w:name="Normal Table"/>
     <w:lsdException w:unhideWhenUsed="0" w:uiPriority="0" w:semiHidden="0" w:name="annotation subject"/>
     <w:lsdException w:unhideWhenUsed="0" w:uiPriority="0" w:semiHidden="0" w:name="Table Simple 1"/>
     <w:lsdException w:unhideWhenUsed="0" w:uiPriority="0" w:semiHidden="0" w:name="Table Simple 2"/>
@@ -2175,6 +2534,7 @@
   <w:style w:type="table" w:default="1" w:styleId="3">
     <w:name w:val="Normal Table"/>
     <w:semiHidden/>
+    <w:qFormat/>
     <w:uiPriority w:val="0"/>
     <w:tblPr>
       <w:tblCellMar>

</xml_diff>

<commit_message>
added actual requirements,changed the system command gaurdrail a bit,changed the temparature,add requriments for dependency installation
</commit_message>
<xml_diff>
--- a/requirements.docx
+++ b/requirements.docx
@@ -5,7 +5,7 @@
     <w:tbl>
       <w:tblPr>
         <w:tblStyle w:val="3"/>
-        <w:tblpPr w:leftFromText="180" w:rightFromText="180" w:vertAnchor="page" w:horzAnchor="page" w:tblpX="897" w:tblpY="1558"/>
+        <w:tblpPr w:leftFromText="180" w:rightFromText="180" w:vertAnchor="page" w:horzAnchor="page" w:tblpX="107" w:tblpY="1628"/>
         <w:tblOverlap w:val="never"/>
         <w:tblW w:w="12930" w:type="dxa"/>
         <w:tblInd w:w="0" w:type="dxa"/>
@@ -376,7 +376,6 @@
             <w:insideH w:val="none" w:color="auto" w:sz="0" w:space="0"/>
             <w:insideV w:val="none" w:color="auto" w:sz="0" w:space="0"/>
           </w:tblBorders>
-          <w:shd w:val="clear" w:color="auto" w:fill="auto"/>
           <w:tblCellMar>
             <w:top w:w="0" w:type="dxa"/>
             <w:left w:w="108" w:type="dxa"/>
@@ -416,6 +415,54 @@
                 <w:sz w:val="22"/>
                 <w:szCs w:val="22"/>
                 <w:u w:val="none"/>
+                <w:lang w:val="en-IN"/>
+              </w:rPr>
+            </w:pPr>
+            <w:r>
+              <w:rPr>
+                <w:rFonts w:hint="default" w:ascii="Calibri" w:hAnsi="Calibri" w:eastAsia="SimSun" w:cs="Calibri"/>
+                <w:i w:val="0"/>
+                <w:iCs w:val="0"/>
+                <w:color w:val="000000"/>
+                <w:kern w:val="0"/>
+                <w:sz w:val="22"/>
+                <w:szCs w:val="22"/>
+                <w:u w:val="none"/>
+                <w:lang w:val="en-IN" w:eastAsia="zh-CN" w:bidi="ar"/>
+              </w:rPr>
+              <w:t>IBM</w:t>
+            </w:r>
+          </w:p>
+        </w:tc>
+        <w:tc>
+          <w:tcPr>
+            <w:tcW w:w="2270" w:type="dxa"/>
+            <w:tcBorders>
+              <w:top w:val="nil"/>
+              <w:left w:val="nil"/>
+              <w:bottom w:val="nil"/>
+              <w:right w:val="nil"/>
+            </w:tcBorders>
+            <w:shd w:val="clear" w:color="auto" w:fill="auto"/>
+            <w:noWrap/>
+            <w:vAlign w:val="center"/>
+          </w:tcPr>
+          <w:p>
+            <w:pPr>
+              <w:keepNext w:val="0"/>
+              <w:keepLines w:val="0"/>
+              <w:widowControl/>
+              <w:suppressLineNumbers w:val="0"/>
+              <w:jc w:val="right"/>
+              <w:textAlignment w:val="center"/>
+              <w:rPr>
+                <w:rFonts w:hint="default" w:ascii="Calibri" w:hAnsi="Calibri" w:cs="Calibri"/>
+                <w:i w:val="0"/>
+                <w:iCs w:val="0"/>
+                <w:color w:val="000000"/>
+                <w:sz w:val="22"/>
+                <w:szCs w:val="22"/>
+                <w:u w:val="none"/>
               </w:rPr>
             </w:pPr>
             <w:r>
@@ -430,13 +477,13 @@
                 <w:u w:val="none"/>
                 <w:lang w:val="en-US" w:eastAsia="zh-CN" w:bidi="ar"/>
               </w:rPr>
-              <w:t>A</w:t>
-            </w:r>
-          </w:p>
-        </w:tc>
-        <w:tc>
-          <w:tcPr>
-            <w:tcW w:w="2270" w:type="dxa"/>
+              <w:t>20</w:t>
+            </w:r>
+          </w:p>
+        </w:tc>
+        <w:tc>
+          <w:tcPr>
+            <w:tcW w:w="1280" w:type="dxa"/>
             <w:tcBorders>
               <w:top w:val="nil"/>
               <w:left w:val="nil"/>
@@ -477,13 +524,13 @@
                 <w:u w:val="none"/>
                 <w:lang w:val="en-US" w:eastAsia="zh-CN" w:bidi="ar"/>
               </w:rPr>
-              <w:t>20</w:t>
-            </w:r>
-          </w:p>
-        </w:tc>
-        <w:tc>
-          <w:tcPr>
-            <w:tcW w:w="1280" w:type="dxa"/>
+              <w:t>10</w:t>
+            </w:r>
+          </w:p>
+        </w:tc>
+        <w:tc>
+          <w:tcPr>
+            <w:tcW w:w="1510" w:type="dxa"/>
             <w:tcBorders>
               <w:top w:val="nil"/>
               <w:left w:val="nil"/>
@@ -530,7 +577,7 @@
         </w:tc>
         <w:tc>
           <w:tcPr>
-            <w:tcW w:w="1510" w:type="dxa"/>
+            <w:tcW w:w="1100" w:type="dxa"/>
             <w:tcBorders>
               <w:top w:val="nil"/>
               <w:left w:val="nil"/>
@@ -557,68 +604,22 @@
                 <w:sz w:val="22"/>
                 <w:szCs w:val="22"/>
                 <w:u w:val="none"/>
-              </w:rPr>
-            </w:pPr>
-            <w:r>
-              <w:rPr>
-                <w:rFonts w:hint="default" w:ascii="Calibri" w:hAnsi="Calibri" w:eastAsia="SimSun" w:cs="Calibri"/>
-                <w:i w:val="0"/>
-                <w:iCs w:val="0"/>
-                <w:color w:val="000000"/>
-                <w:kern w:val="0"/>
-                <w:sz w:val="22"/>
-                <w:szCs w:val="22"/>
-                <w:u w:val="none"/>
-                <w:lang w:val="en-US" w:eastAsia="zh-CN" w:bidi="ar"/>
-              </w:rPr>
-              <w:t>10</w:t>
-            </w:r>
-          </w:p>
-        </w:tc>
-        <w:tc>
-          <w:tcPr>
-            <w:tcW w:w="1100" w:type="dxa"/>
-            <w:tcBorders>
-              <w:top w:val="nil"/>
-              <w:left w:val="nil"/>
-              <w:bottom w:val="nil"/>
-              <w:right w:val="nil"/>
-            </w:tcBorders>
-            <w:shd w:val="clear" w:color="auto" w:fill="auto"/>
-            <w:noWrap/>
-            <w:vAlign w:val="center"/>
-          </w:tcPr>
-          <w:p>
-            <w:pPr>
-              <w:keepNext w:val="0"/>
-              <w:keepLines w:val="0"/>
-              <w:widowControl/>
-              <w:suppressLineNumbers w:val="0"/>
-              <w:jc w:val="right"/>
-              <w:textAlignment w:val="center"/>
-              <w:rPr>
-                <w:rFonts w:hint="default" w:ascii="Calibri" w:hAnsi="Calibri" w:cs="Calibri"/>
-                <w:i w:val="0"/>
-                <w:iCs w:val="0"/>
-                <w:color w:val="000000"/>
-                <w:sz w:val="22"/>
-                <w:szCs w:val="22"/>
-                <w:u w:val="none"/>
-              </w:rPr>
-            </w:pPr>
-            <w:r>
-              <w:rPr>
-                <w:rFonts w:hint="default" w:ascii="Calibri" w:hAnsi="Calibri" w:eastAsia="SimSun" w:cs="Calibri"/>
-                <w:i w:val="0"/>
-                <w:iCs w:val="0"/>
-                <w:color w:val="000000"/>
-                <w:kern w:val="0"/>
-                <w:sz w:val="22"/>
-                <w:szCs w:val="22"/>
-                <w:u w:val="none"/>
-                <w:lang w:val="en-US" w:eastAsia="zh-CN" w:bidi="ar"/>
-              </w:rPr>
-              <w:t>400</w:t>
+                <w:lang w:val="en-IN"/>
+              </w:rPr>
+            </w:pPr>
+            <w:r>
+              <w:rPr>
+                <w:rFonts w:hint="default" w:ascii="Calibri" w:hAnsi="Calibri" w:eastAsia="SimSun" w:cs="Calibri"/>
+                <w:i w:val="0"/>
+                <w:iCs w:val="0"/>
+                <w:color w:val="000000"/>
+                <w:kern w:val="0"/>
+                <w:sz w:val="22"/>
+                <w:szCs w:val="22"/>
+                <w:u w:val="none"/>
+                <w:lang w:val="en-IN" w:eastAsia="zh-CN" w:bidi="ar"/>
+              </w:rPr>
+              <w:t>150</w:t>
             </w:r>
           </w:p>
         </w:tc>
@@ -641,7 +642,7 @@
               <w:keepLines w:val="0"/>
               <w:widowControl/>
               <w:suppressLineNumbers w:val="0"/>
-              <w:jc w:val="right"/>
+              <w:jc w:val="left"/>
               <w:textAlignment w:val="center"/>
               <w:rPr>
                 <w:rFonts w:hint="default" w:ascii="Calibri" w:hAnsi="Calibri" w:eastAsia="SimSun" w:cs="Calibri"/>
@@ -668,7 +669,6 @@
             <w:insideH w:val="none" w:color="auto" w:sz="0" w:space="0"/>
             <w:insideV w:val="none" w:color="auto" w:sz="0" w:space="0"/>
           </w:tblBorders>
-          <w:shd w:val="clear" w:color="auto" w:fill="auto"/>
           <w:tblCellMar>
             <w:top w:w="0" w:type="dxa"/>
             <w:left w:w="108" w:type="dxa"/>
@@ -708,6 +708,54 @@
                 <w:sz w:val="22"/>
                 <w:szCs w:val="22"/>
                 <w:u w:val="none"/>
+                <w:lang w:val="en-IN"/>
+              </w:rPr>
+            </w:pPr>
+            <w:r>
+              <w:rPr>
+                <w:rFonts w:hint="default" w:ascii="Calibri" w:hAnsi="Calibri" w:eastAsia="SimSun" w:cs="Calibri"/>
+                <w:i w:val="0"/>
+                <w:iCs w:val="0"/>
+                <w:color w:val="000000"/>
+                <w:kern w:val="0"/>
+                <w:sz w:val="22"/>
+                <w:szCs w:val="22"/>
+                <w:u w:val="none"/>
+                <w:lang w:val="en-IN" w:eastAsia="zh-CN" w:bidi="ar"/>
+              </w:rPr>
+              <w:t>MSFT</w:t>
+            </w:r>
+          </w:p>
+        </w:tc>
+        <w:tc>
+          <w:tcPr>
+            <w:tcW w:w="2270" w:type="dxa"/>
+            <w:tcBorders>
+              <w:top w:val="nil"/>
+              <w:left w:val="nil"/>
+              <w:bottom w:val="nil"/>
+              <w:right w:val="nil"/>
+            </w:tcBorders>
+            <w:shd w:val="clear" w:color="auto" w:fill="auto"/>
+            <w:noWrap/>
+            <w:vAlign w:val="center"/>
+          </w:tcPr>
+          <w:p>
+            <w:pPr>
+              <w:keepNext w:val="0"/>
+              <w:keepLines w:val="0"/>
+              <w:widowControl/>
+              <w:suppressLineNumbers w:val="0"/>
+              <w:jc w:val="right"/>
+              <w:textAlignment w:val="center"/>
+              <w:rPr>
+                <w:rFonts w:hint="default" w:ascii="Calibri" w:hAnsi="Calibri" w:cs="Calibri"/>
+                <w:i w:val="0"/>
+                <w:iCs w:val="0"/>
+                <w:color w:val="000000"/>
+                <w:sz w:val="22"/>
+                <w:szCs w:val="22"/>
+                <w:u w:val="none"/>
               </w:rPr>
             </w:pPr>
             <w:r>
@@ -722,7 +770,253 @@
                 <w:u w:val="none"/>
                 <w:lang w:val="en-US" w:eastAsia="zh-CN" w:bidi="ar"/>
               </w:rPr>
-              <w:t>B</w:t>
+              <w:t>20</w:t>
+            </w:r>
+          </w:p>
+        </w:tc>
+        <w:tc>
+          <w:tcPr>
+            <w:tcW w:w="1280" w:type="dxa"/>
+            <w:tcBorders>
+              <w:top w:val="nil"/>
+              <w:left w:val="nil"/>
+              <w:bottom w:val="nil"/>
+              <w:right w:val="nil"/>
+            </w:tcBorders>
+            <w:shd w:val="clear" w:color="auto" w:fill="auto"/>
+            <w:noWrap/>
+            <w:vAlign w:val="center"/>
+          </w:tcPr>
+          <w:p>
+            <w:pPr>
+              <w:keepNext w:val="0"/>
+              <w:keepLines w:val="0"/>
+              <w:widowControl/>
+              <w:suppressLineNumbers w:val="0"/>
+              <w:jc w:val="right"/>
+              <w:textAlignment w:val="center"/>
+              <w:rPr>
+                <w:rFonts w:hint="default" w:ascii="Calibri" w:hAnsi="Calibri" w:cs="Calibri"/>
+                <w:i w:val="0"/>
+                <w:iCs w:val="0"/>
+                <w:color w:val="000000"/>
+                <w:sz w:val="22"/>
+                <w:szCs w:val="22"/>
+                <w:u w:val="none"/>
+                <w:lang w:val="en-IN"/>
+              </w:rPr>
+            </w:pPr>
+            <w:r>
+              <w:rPr>
+                <w:rFonts w:hint="default" w:ascii="Calibri" w:hAnsi="Calibri" w:eastAsia="SimSun" w:cs="Calibri"/>
+                <w:i w:val="0"/>
+                <w:iCs w:val="0"/>
+                <w:color w:val="000000"/>
+                <w:kern w:val="0"/>
+                <w:sz w:val="22"/>
+                <w:szCs w:val="22"/>
+                <w:u w:val="none"/>
+                <w:lang w:val="en-IN" w:eastAsia="zh-CN" w:bidi="ar"/>
+              </w:rPr>
+              <w:t>20</w:t>
+            </w:r>
+          </w:p>
+        </w:tc>
+        <w:tc>
+          <w:tcPr>
+            <w:tcW w:w="1510" w:type="dxa"/>
+            <w:tcBorders>
+              <w:top w:val="nil"/>
+              <w:left w:val="nil"/>
+              <w:bottom w:val="nil"/>
+              <w:right w:val="nil"/>
+            </w:tcBorders>
+            <w:shd w:val="clear" w:color="auto" w:fill="auto"/>
+            <w:noWrap/>
+            <w:vAlign w:val="center"/>
+          </w:tcPr>
+          <w:p>
+            <w:pPr>
+              <w:keepNext w:val="0"/>
+              <w:keepLines w:val="0"/>
+              <w:widowControl/>
+              <w:suppressLineNumbers w:val="0"/>
+              <w:jc w:val="right"/>
+              <w:textAlignment w:val="center"/>
+              <w:rPr>
+                <w:rFonts w:hint="default" w:ascii="Calibri" w:hAnsi="Calibri" w:cs="Calibri"/>
+                <w:i w:val="0"/>
+                <w:iCs w:val="0"/>
+                <w:color w:val="000000"/>
+                <w:sz w:val="22"/>
+                <w:szCs w:val="22"/>
+                <w:u w:val="none"/>
+                <w:lang w:val="en-IN"/>
+              </w:rPr>
+            </w:pPr>
+            <w:r>
+              <w:rPr>
+                <w:rFonts w:hint="default" w:ascii="Calibri" w:hAnsi="Calibri" w:cs="Calibri"/>
+                <w:i w:val="0"/>
+                <w:iCs w:val="0"/>
+                <w:color w:val="000000"/>
+                <w:sz w:val="22"/>
+                <w:szCs w:val="22"/>
+                <w:u w:val="none"/>
+                <w:lang w:val="en-IN"/>
+              </w:rPr>
+              <w:t>0</w:t>
+            </w:r>
+          </w:p>
+        </w:tc>
+        <w:tc>
+          <w:tcPr>
+            <w:tcW w:w="1100" w:type="dxa"/>
+            <w:tcBorders>
+              <w:top w:val="nil"/>
+              <w:left w:val="nil"/>
+              <w:bottom w:val="nil"/>
+              <w:right w:val="nil"/>
+            </w:tcBorders>
+            <w:shd w:val="clear" w:color="auto" w:fill="auto"/>
+            <w:noWrap/>
+            <w:vAlign w:val="center"/>
+          </w:tcPr>
+          <w:p>
+            <w:pPr>
+              <w:keepNext w:val="0"/>
+              <w:keepLines w:val="0"/>
+              <w:widowControl/>
+              <w:suppressLineNumbers w:val="0"/>
+              <w:jc w:val="right"/>
+              <w:textAlignment w:val="center"/>
+              <w:rPr>
+                <w:rFonts w:hint="default" w:ascii="Calibri" w:hAnsi="Calibri" w:cs="Calibri"/>
+                <w:i w:val="0"/>
+                <w:iCs w:val="0"/>
+                <w:color w:val="000000"/>
+                <w:sz w:val="22"/>
+                <w:szCs w:val="22"/>
+                <w:u w:val="none"/>
+              </w:rPr>
+            </w:pPr>
+            <w:r>
+              <w:rPr>
+                <w:rFonts w:hint="default" w:ascii="Calibri" w:hAnsi="Calibri" w:eastAsia="SimSun" w:cs="Calibri"/>
+                <w:i w:val="0"/>
+                <w:iCs w:val="0"/>
+                <w:color w:val="000000"/>
+                <w:kern w:val="0"/>
+                <w:sz w:val="22"/>
+                <w:szCs w:val="22"/>
+                <w:u w:val="none"/>
+                <w:lang w:val="en-US" w:eastAsia="zh-CN" w:bidi="ar"/>
+              </w:rPr>
+              <w:t>90</w:t>
+            </w:r>
+          </w:p>
+        </w:tc>
+        <w:tc>
+          <w:tcPr>
+            <w:tcW w:w="4890" w:type="dxa"/>
+            <w:tcBorders>
+              <w:top w:val="nil"/>
+              <w:left w:val="nil"/>
+              <w:bottom w:val="nil"/>
+              <w:right w:val="nil"/>
+            </w:tcBorders>
+            <w:shd w:val="clear" w:color="auto" w:fill="auto"/>
+            <w:noWrap/>
+            <w:vAlign w:val="center"/>
+          </w:tcPr>
+          <w:p>
+            <w:pPr>
+              <w:keepNext w:val="0"/>
+              <w:keepLines w:val="0"/>
+              <w:widowControl/>
+              <w:suppressLineNumbers w:val="0"/>
+              <w:jc w:val="left"/>
+              <w:textAlignment w:val="center"/>
+              <w:rPr>
+                <w:rFonts w:hint="default" w:ascii="Calibri" w:hAnsi="Calibri" w:eastAsia="SimSun" w:cs="Calibri"/>
+                <w:i w:val="0"/>
+                <w:iCs w:val="0"/>
+                <w:color w:val="000000"/>
+                <w:kern w:val="0"/>
+                <w:sz w:val="22"/>
+                <w:szCs w:val="22"/>
+                <w:u w:val="none"/>
+                <w:lang w:val="en-US" w:eastAsia="zh-CN" w:bidi="ar"/>
+              </w:rPr>
+            </w:pPr>
+          </w:p>
+        </w:tc>
+      </w:tr>
+      <w:tr>
+        <w:tblPrEx>
+          <w:tblBorders>
+            <w:top w:val="none" w:color="auto" w:sz="0" w:space="0"/>
+            <w:left w:val="none" w:color="auto" w:sz="0" w:space="0"/>
+            <w:bottom w:val="none" w:color="auto" w:sz="0" w:space="0"/>
+            <w:right w:val="none" w:color="auto" w:sz="0" w:space="0"/>
+            <w:insideH w:val="none" w:color="auto" w:sz="0" w:space="0"/>
+            <w:insideV w:val="none" w:color="auto" w:sz="0" w:space="0"/>
+          </w:tblBorders>
+          <w:tblCellMar>
+            <w:top w:w="0" w:type="dxa"/>
+            <w:left w:w="108" w:type="dxa"/>
+            <w:bottom w:w="0" w:type="dxa"/>
+            <w:right w:w="108" w:type="dxa"/>
+          </w:tblCellMar>
+        </w:tblPrEx>
+        <w:trPr>
+          <w:trHeight w:val="290" w:hRule="atLeast"/>
+        </w:trPr>
+        <w:tc>
+          <w:tcPr>
+            <w:tcW w:w="1880" w:type="dxa"/>
+            <w:tcBorders>
+              <w:top w:val="nil"/>
+              <w:left w:val="nil"/>
+              <w:bottom w:val="nil"/>
+              <w:right w:val="nil"/>
+            </w:tcBorders>
+            <w:shd w:val="clear" w:color="auto" w:fill="auto"/>
+            <w:noWrap/>
+            <w:vAlign w:val="center"/>
+          </w:tcPr>
+          <w:p>
+            <w:pPr>
+              <w:keepNext w:val="0"/>
+              <w:keepLines w:val="0"/>
+              <w:widowControl/>
+              <w:suppressLineNumbers w:val="0"/>
+              <w:jc w:val="left"/>
+              <w:textAlignment w:val="center"/>
+              <w:rPr>
+                <w:rFonts w:hint="default" w:ascii="Calibri" w:hAnsi="Calibri" w:cs="Calibri"/>
+                <w:i w:val="0"/>
+                <w:iCs w:val="0"/>
+                <w:color w:val="000000"/>
+                <w:sz w:val="22"/>
+                <w:szCs w:val="22"/>
+                <w:u w:val="none"/>
+                <w:lang w:val="en-IN"/>
+              </w:rPr>
+            </w:pPr>
+            <w:r>
+              <w:rPr>
+                <w:rFonts w:hint="default" w:ascii="Calibri" w:hAnsi="Calibri" w:eastAsia="SimSun" w:cs="Calibri"/>
+                <w:i w:val="0"/>
+                <w:iCs w:val="0"/>
+                <w:color w:val="000000"/>
+                <w:kern w:val="0"/>
+                <w:sz w:val="22"/>
+                <w:szCs w:val="22"/>
+                <w:u w:val="none"/>
+                <w:lang w:val="en-IN" w:eastAsia="zh-CN" w:bidi="ar"/>
+              </w:rPr>
+              <w:t>ORCL</w:t>
             </w:r>
           </w:p>
         </w:tc>
@@ -817,12 +1111,306 @@
                 <w:u w:val="none"/>
                 <w:lang w:val="en-IN" w:eastAsia="zh-CN" w:bidi="ar"/>
               </w:rPr>
+              <w:t>30</w:t>
+            </w:r>
+          </w:p>
+        </w:tc>
+        <w:tc>
+          <w:tcPr>
+            <w:tcW w:w="1510" w:type="dxa"/>
+            <w:tcBorders>
+              <w:top w:val="nil"/>
+              <w:left w:val="nil"/>
+              <w:bottom w:val="nil"/>
+              <w:right w:val="nil"/>
+            </w:tcBorders>
+            <w:shd w:val="clear" w:color="auto" w:fill="auto"/>
+            <w:noWrap/>
+            <w:vAlign w:val="center"/>
+          </w:tcPr>
+          <w:p>
+            <w:pPr>
+              <w:keepNext w:val="0"/>
+              <w:keepLines w:val="0"/>
+              <w:widowControl/>
+              <w:suppressLineNumbers w:val="0"/>
+              <w:jc w:val="right"/>
+              <w:textAlignment w:val="center"/>
+              <w:rPr>
+                <w:rFonts w:hint="default" w:ascii="Calibri" w:hAnsi="Calibri" w:cs="Calibri"/>
+                <w:i w:val="0"/>
+                <w:iCs w:val="0"/>
+                <w:color w:val="000000"/>
+                <w:sz w:val="22"/>
+                <w:szCs w:val="22"/>
+                <w:u w:val="none"/>
+                <w:lang w:val="en-IN"/>
+              </w:rPr>
+            </w:pPr>
+            <w:r>
+              <w:rPr>
+                <w:rFonts w:hint="default" w:ascii="Calibri" w:hAnsi="Calibri" w:eastAsia="SimSun" w:cs="Calibri"/>
+                <w:i w:val="0"/>
+                <w:iCs w:val="0"/>
+                <w:color w:val="000000"/>
+                <w:kern w:val="0"/>
+                <w:sz w:val="22"/>
+                <w:szCs w:val="22"/>
+                <w:u w:val="none"/>
+                <w:lang w:val="en-IN" w:eastAsia="zh-CN" w:bidi="ar"/>
+              </w:rPr>
+              <w:t>-10</w:t>
+            </w:r>
+          </w:p>
+        </w:tc>
+        <w:tc>
+          <w:tcPr>
+            <w:tcW w:w="1100" w:type="dxa"/>
+            <w:tcBorders>
+              <w:top w:val="nil"/>
+              <w:left w:val="nil"/>
+              <w:bottom w:val="nil"/>
+              <w:right w:val="nil"/>
+            </w:tcBorders>
+            <w:shd w:val="clear" w:color="auto" w:fill="auto"/>
+            <w:noWrap/>
+            <w:vAlign w:val="center"/>
+          </w:tcPr>
+          <w:p>
+            <w:pPr>
+              <w:keepNext w:val="0"/>
+              <w:keepLines w:val="0"/>
+              <w:widowControl/>
+              <w:suppressLineNumbers w:val="0"/>
+              <w:jc w:val="right"/>
+              <w:textAlignment w:val="center"/>
+              <w:rPr>
+                <w:rFonts w:hint="default" w:ascii="Calibri" w:hAnsi="Calibri" w:cs="Calibri"/>
+                <w:i w:val="0"/>
+                <w:iCs w:val="0"/>
+                <w:color w:val="000000"/>
+                <w:sz w:val="22"/>
+                <w:szCs w:val="22"/>
+                <w:u w:val="none"/>
+                <w:lang w:val="en-IN"/>
+              </w:rPr>
+            </w:pPr>
+            <w:r>
+              <w:rPr>
+                <w:rFonts w:hint="default" w:ascii="Calibri" w:hAnsi="Calibri" w:eastAsia="SimSun" w:cs="Calibri"/>
+                <w:i w:val="0"/>
+                <w:iCs w:val="0"/>
+                <w:color w:val="000000"/>
+                <w:kern w:val="0"/>
+                <w:sz w:val="22"/>
+                <w:szCs w:val="22"/>
+                <w:u w:val="none"/>
+                <w:lang w:val="en-IN" w:eastAsia="zh-CN" w:bidi="ar"/>
+              </w:rPr>
+              <w:t>220</w:t>
+            </w:r>
+          </w:p>
+        </w:tc>
+        <w:tc>
+          <w:tcPr>
+            <w:tcW w:w="4890" w:type="dxa"/>
+            <w:tcBorders>
+              <w:top w:val="nil"/>
+              <w:left w:val="nil"/>
+              <w:bottom w:val="nil"/>
+              <w:right w:val="nil"/>
+            </w:tcBorders>
+            <w:shd w:val="clear" w:color="auto" w:fill="auto"/>
+            <w:noWrap/>
+            <w:vAlign w:val="center"/>
+          </w:tcPr>
+          <w:p>
+            <w:pPr>
+              <w:keepNext w:val="0"/>
+              <w:keepLines w:val="0"/>
+              <w:widowControl/>
+              <w:suppressLineNumbers w:val="0"/>
+              <w:jc w:val="left"/>
+              <w:textAlignment w:val="center"/>
+              <w:rPr>
+                <w:rFonts w:hint="default" w:ascii="Calibri" w:hAnsi="Calibri" w:eastAsia="SimSun" w:cs="Calibri"/>
+                <w:i w:val="0"/>
+                <w:iCs w:val="0"/>
+                <w:color w:val="000000"/>
+                <w:kern w:val="0"/>
+                <w:sz w:val="22"/>
+                <w:szCs w:val="22"/>
+                <w:u w:val="none"/>
+                <w:lang w:val="en-US" w:eastAsia="zh-CN" w:bidi="ar"/>
+              </w:rPr>
+            </w:pPr>
+          </w:p>
+        </w:tc>
+      </w:tr>
+      <w:tr>
+        <w:tblPrEx>
+          <w:tblBorders>
+            <w:top w:val="none" w:color="auto" w:sz="0" w:space="0"/>
+            <w:left w:val="none" w:color="auto" w:sz="0" w:space="0"/>
+            <w:bottom w:val="none" w:color="auto" w:sz="0" w:space="0"/>
+            <w:right w:val="none" w:color="auto" w:sz="0" w:space="0"/>
+            <w:insideH w:val="none" w:color="auto" w:sz="0" w:space="0"/>
+            <w:insideV w:val="none" w:color="auto" w:sz="0" w:space="0"/>
+          </w:tblBorders>
+          <w:tblCellMar>
+            <w:top w:w="0" w:type="dxa"/>
+            <w:left w:w="108" w:type="dxa"/>
+            <w:bottom w:w="0" w:type="dxa"/>
+            <w:right w:w="108" w:type="dxa"/>
+          </w:tblCellMar>
+        </w:tblPrEx>
+        <w:trPr>
+          <w:trHeight w:val="290" w:hRule="atLeast"/>
+        </w:trPr>
+        <w:tc>
+          <w:tcPr>
+            <w:tcW w:w="1880" w:type="dxa"/>
+            <w:tcBorders>
+              <w:top w:val="nil"/>
+              <w:left w:val="nil"/>
+              <w:bottom w:val="nil"/>
+              <w:right w:val="nil"/>
+            </w:tcBorders>
+            <w:shd w:val="clear" w:color="auto" w:fill="auto"/>
+            <w:noWrap/>
+            <w:vAlign w:val="center"/>
+          </w:tcPr>
+          <w:p>
+            <w:pPr>
+              <w:keepNext w:val="0"/>
+              <w:keepLines w:val="0"/>
+              <w:widowControl/>
+              <w:suppressLineNumbers w:val="0"/>
+              <w:jc w:val="left"/>
+              <w:textAlignment w:val="center"/>
+              <w:rPr>
+                <w:rFonts w:hint="default" w:ascii="Calibri" w:hAnsi="Calibri" w:cs="Calibri"/>
+                <w:i w:val="0"/>
+                <w:iCs w:val="0"/>
+                <w:color w:val="000000"/>
+                <w:sz w:val="22"/>
+                <w:szCs w:val="22"/>
+                <w:u w:val="none"/>
+                <w:lang w:val="en-IN"/>
+              </w:rPr>
+            </w:pPr>
+            <w:r>
+              <w:rPr>
+                <w:rFonts w:hint="default" w:ascii="Calibri" w:hAnsi="Calibri" w:eastAsia="SimSun" w:cs="Calibri"/>
+                <w:i w:val="0"/>
+                <w:iCs w:val="0"/>
+                <w:color w:val="000000"/>
+                <w:kern w:val="0"/>
+                <w:sz w:val="22"/>
+                <w:szCs w:val="22"/>
+                <w:u w:val="none"/>
+                <w:lang w:val="en-IN" w:eastAsia="zh-CN" w:bidi="ar"/>
+              </w:rPr>
+              <w:t>AAPL</w:t>
+            </w:r>
+          </w:p>
+        </w:tc>
+        <w:tc>
+          <w:tcPr>
+            <w:tcW w:w="2270" w:type="dxa"/>
+            <w:tcBorders>
+              <w:top w:val="nil"/>
+              <w:left w:val="nil"/>
+              <w:bottom w:val="nil"/>
+              <w:right w:val="nil"/>
+            </w:tcBorders>
+            <w:shd w:val="clear" w:color="auto" w:fill="auto"/>
+            <w:noWrap/>
+            <w:vAlign w:val="center"/>
+          </w:tcPr>
+          <w:p>
+            <w:pPr>
+              <w:keepNext w:val="0"/>
+              <w:keepLines w:val="0"/>
+              <w:widowControl/>
+              <w:suppressLineNumbers w:val="0"/>
+              <w:jc w:val="right"/>
+              <w:textAlignment w:val="center"/>
+              <w:rPr>
+                <w:rFonts w:hint="default" w:ascii="Calibri" w:hAnsi="Calibri" w:cs="Calibri"/>
+                <w:i w:val="0"/>
+                <w:iCs w:val="0"/>
+                <w:color w:val="000000"/>
+                <w:sz w:val="22"/>
+                <w:szCs w:val="22"/>
+                <w:u w:val="none"/>
+              </w:rPr>
+            </w:pPr>
+            <w:r>
+              <w:rPr>
+                <w:rFonts w:hint="default" w:ascii="Calibri" w:hAnsi="Calibri" w:eastAsia="SimSun" w:cs="Calibri"/>
+                <w:i w:val="0"/>
+                <w:iCs w:val="0"/>
+                <w:color w:val="000000"/>
+                <w:kern w:val="0"/>
+                <w:sz w:val="22"/>
+                <w:szCs w:val="22"/>
+                <w:u w:val="none"/>
+                <w:lang w:val="en-US" w:eastAsia="zh-CN" w:bidi="ar"/>
+              </w:rPr>
               <w:t>20</w:t>
             </w:r>
           </w:p>
         </w:tc>
         <w:tc>
           <w:tcPr>
+            <w:tcW w:w="1280" w:type="dxa"/>
+            <w:tcBorders>
+              <w:top w:val="nil"/>
+              <w:left w:val="nil"/>
+              <w:bottom w:val="nil"/>
+              <w:right w:val="nil"/>
+            </w:tcBorders>
+            <w:shd w:val="clear" w:color="auto" w:fill="auto"/>
+            <w:noWrap/>
+            <w:vAlign w:val="center"/>
+          </w:tcPr>
+          <w:p>
+            <w:pPr>
+              <w:keepNext w:val="0"/>
+              <w:keepLines w:val="0"/>
+              <w:widowControl/>
+              <w:suppressLineNumbers w:val="0"/>
+              <w:jc w:val="right"/>
+              <w:textAlignment w:val="center"/>
+              <w:rPr>
+                <w:rFonts w:hint="default" w:ascii="Calibri" w:hAnsi="Calibri" w:cs="Calibri"/>
+                <w:i w:val="0"/>
+                <w:iCs w:val="0"/>
+                <w:color w:val="000000"/>
+                <w:sz w:val="22"/>
+                <w:szCs w:val="22"/>
+                <w:u w:val="none"/>
+              </w:rPr>
+            </w:pPr>
+            <w:r>
+              <w:rPr>
+                <w:rFonts w:hint="default" w:ascii="Calibri" w:hAnsi="Calibri" w:eastAsia="SimSun" w:cs="Calibri"/>
+                <w:i w:val="0"/>
+                <w:iCs w:val="0"/>
+                <w:color w:val="000000"/>
+                <w:kern w:val="0"/>
+                <w:sz w:val="22"/>
+                <w:szCs w:val="22"/>
+                <w:u w:val="none"/>
+                <w:lang w:val="en-US" w:eastAsia="zh-CN" w:bidi="ar"/>
+              </w:rPr>
+              <w:t>20</w:t>
+            </w:r>
+          </w:p>
+        </w:tc>
+        <w:tc>
+          <w:tcPr>
             <w:tcW w:w="1510" w:type="dxa"/>
             <w:tcBorders>
               <w:top w:val="nil"/>
@@ -862,70 +1450,57 @@
                 <w:sz w:val="22"/>
                 <w:szCs w:val="22"/>
                 <w:u w:val="none"/>
+                <w:lang w:val="en-US" w:eastAsia="zh-CN" w:bidi="ar"/>
+              </w:rPr>
+              <w:t>0</w:t>
+            </w:r>
+          </w:p>
+        </w:tc>
+        <w:tc>
+          <w:tcPr>
+            <w:tcW w:w="1100" w:type="dxa"/>
+            <w:tcBorders>
+              <w:top w:val="nil"/>
+              <w:left w:val="nil"/>
+              <w:bottom w:val="nil"/>
+              <w:right w:val="nil"/>
+            </w:tcBorders>
+            <w:shd w:val="clear" w:color="auto" w:fill="auto"/>
+            <w:noWrap/>
+            <w:vAlign w:val="center"/>
+          </w:tcPr>
+          <w:p>
+            <w:pPr>
+              <w:keepNext w:val="0"/>
+              <w:keepLines w:val="0"/>
+              <w:widowControl/>
+              <w:suppressLineNumbers w:val="0"/>
+              <w:jc w:val="right"/>
+              <w:textAlignment w:val="center"/>
+              <w:rPr>
+                <w:rFonts w:hint="default" w:ascii="Calibri" w:hAnsi="Calibri" w:cs="Calibri"/>
+                <w:i w:val="0"/>
+                <w:iCs w:val="0"/>
+                <w:color w:val="000000"/>
+                <w:sz w:val="22"/>
+                <w:szCs w:val="22"/>
+                <w:u w:val="none"/>
+                <w:lang w:val="en-IN"/>
+              </w:rPr>
+            </w:pPr>
+            <w:r>
+              <w:rPr>
+                <w:rFonts w:hint="default" w:ascii="Calibri" w:hAnsi="Calibri" w:eastAsia="SimSun" w:cs="Calibri"/>
+                <w:i w:val="0"/>
+                <w:iCs w:val="0"/>
+                <w:color w:val="000000"/>
+                <w:kern w:val="0"/>
+                <w:sz w:val="22"/>
+                <w:szCs w:val="22"/>
+                <w:u w:val="none"/>
                 <w:lang w:val="en-IN" w:eastAsia="zh-CN" w:bidi="ar"/>
               </w:rPr>
-              <w:t>-</w:t>
-            </w:r>
-            <w:r>
-              <w:rPr>
-                <w:rFonts w:hint="default" w:ascii="Calibri" w:hAnsi="Calibri" w:eastAsia="SimSun" w:cs="Calibri"/>
-                <w:i w:val="0"/>
-                <w:iCs w:val="0"/>
-                <w:color w:val="000000"/>
-                <w:kern w:val="0"/>
-                <w:sz w:val="22"/>
-                <w:szCs w:val="22"/>
-                <w:u w:val="none"/>
-                <w:lang w:val="en-US" w:eastAsia="zh-CN" w:bidi="ar"/>
-              </w:rPr>
-              <w:t>10</w:t>
-            </w:r>
-          </w:p>
-        </w:tc>
-        <w:tc>
-          <w:tcPr>
-            <w:tcW w:w="1100" w:type="dxa"/>
-            <w:tcBorders>
-              <w:top w:val="nil"/>
-              <w:left w:val="nil"/>
-              <w:bottom w:val="nil"/>
-              <w:right w:val="nil"/>
-            </w:tcBorders>
-            <w:shd w:val="clear" w:color="auto" w:fill="auto"/>
-            <w:noWrap/>
-            <w:vAlign w:val="center"/>
-          </w:tcPr>
-          <w:p>
-            <w:pPr>
-              <w:keepNext w:val="0"/>
-              <w:keepLines w:val="0"/>
-              <w:widowControl/>
-              <w:suppressLineNumbers w:val="0"/>
-              <w:jc w:val="right"/>
-              <w:textAlignment w:val="center"/>
-              <w:rPr>
-                <w:rFonts w:hint="default" w:ascii="Calibri" w:hAnsi="Calibri" w:cs="Calibri"/>
-                <w:i w:val="0"/>
-                <w:iCs w:val="0"/>
-                <w:color w:val="000000"/>
-                <w:sz w:val="22"/>
-                <w:szCs w:val="22"/>
-                <w:u w:val="none"/>
-              </w:rPr>
-            </w:pPr>
-            <w:r>
-              <w:rPr>
-                <w:rFonts w:hint="default" w:ascii="Calibri" w:hAnsi="Calibri" w:eastAsia="SimSun" w:cs="Calibri"/>
-                <w:i w:val="0"/>
-                <w:iCs w:val="0"/>
-                <w:color w:val="000000"/>
-                <w:kern w:val="0"/>
-                <w:sz w:val="22"/>
-                <w:szCs w:val="22"/>
-                <w:u w:val="none"/>
-                <w:lang w:val="en-US" w:eastAsia="zh-CN" w:bidi="ar"/>
-              </w:rPr>
-              <w:t>90</w:t>
+              <w:t>450</w:t>
             </w:r>
           </w:p>
         </w:tc>
@@ -948,7 +1523,7 @@
               <w:keepLines w:val="0"/>
               <w:widowControl/>
               <w:suppressLineNumbers w:val="0"/>
-              <w:jc w:val="right"/>
+              <w:jc w:val="left"/>
               <w:textAlignment w:val="center"/>
               <w:rPr>
                 <w:rFonts w:hint="default" w:ascii="Calibri" w:hAnsi="Calibri" w:eastAsia="SimSun" w:cs="Calibri"/>
@@ -1015,6 +1590,54 @@
                 <w:sz w:val="22"/>
                 <w:szCs w:val="22"/>
                 <w:u w:val="none"/>
+                <w:lang w:val="en-IN"/>
+              </w:rPr>
+            </w:pPr>
+            <w:r>
+              <w:rPr>
+                <w:rFonts w:hint="default" w:ascii="Calibri" w:hAnsi="Calibri" w:eastAsia="SimSun" w:cs="Calibri"/>
+                <w:i w:val="0"/>
+                <w:iCs w:val="0"/>
+                <w:color w:val="000000"/>
+                <w:kern w:val="0"/>
+                <w:sz w:val="22"/>
+                <w:szCs w:val="22"/>
+                <w:u w:val="none"/>
+                <w:lang w:val="en-IN" w:eastAsia="zh-CN" w:bidi="ar"/>
+              </w:rPr>
+              <w:t>HD</w:t>
+            </w:r>
+          </w:p>
+        </w:tc>
+        <w:tc>
+          <w:tcPr>
+            <w:tcW w:w="2270" w:type="dxa"/>
+            <w:tcBorders>
+              <w:top w:val="nil"/>
+              <w:left w:val="nil"/>
+              <w:bottom w:val="nil"/>
+              <w:right w:val="nil"/>
+            </w:tcBorders>
+            <w:shd w:val="clear" w:color="auto" w:fill="auto"/>
+            <w:noWrap/>
+            <w:vAlign w:val="center"/>
+          </w:tcPr>
+          <w:p>
+            <w:pPr>
+              <w:keepNext w:val="0"/>
+              <w:keepLines w:val="0"/>
+              <w:widowControl/>
+              <w:suppressLineNumbers w:val="0"/>
+              <w:jc w:val="right"/>
+              <w:textAlignment w:val="center"/>
+              <w:rPr>
+                <w:rFonts w:hint="default" w:ascii="Calibri" w:hAnsi="Calibri" w:cs="Calibri"/>
+                <w:i w:val="0"/>
+                <w:iCs w:val="0"/>
+                <w:color w:val="000000"/>
+                <w:sz w:val="22"/>
+                <w:szCs w:val="22"/>
+                <w:u w:val="none"/>
               </w:rPr>
             </w:pPr>
             <w:r>
@@ -1029,13 +1652,13 @@
                 <w:u w:val="none"/>
                 <w:lang w:val="en-US" w:eastAsia="zh-CN" w:bidi="ar"/>
               </w:rPr>
-              <w:t>C</w:t>
-            </w:r>
-          </w:p>
-        </w:tc>
-        <w:tc>
-          <w:tcPr>
-            <w:tcW w:w="2270" w:type="dxa"/>
+              <w:t>20</w:t>
+            </w:r>
+          </w:p>
+        </w:tc>
+        <w:tc>
+          <w:tcPr>
+            <w:tcW w:w="1280" w:type="dxa"/>
             <w:tcBorders>
               <w:top w:val="nil"/>
               <w:left w:val="nil"/>
@@ -1082,7 +1705,7 @@
         </w:tc>
         <w:tc>
           <w:tcPr>
-            <w:tcW w:w="1280" w:type="dxa"/>
+            <w:tcW w:w="1510" w:type="dxa"/>
             <w:tcBorders>
               <w:top w:val="nil"/>
               <w:left w:val="nil"/>
@@ -1109,6 +1732,53 @@
                 <w:sz w:val="22"/>
                 <w:szCs w:val="22"/>
                 <w:u w:val="none"/>
+              </w:rPr>
+            </w:pPr>
+            <w:r>
+              <w:rPr>
+                <w:rFonts w:hint="default" w:ascii="Calibri" w:hAnsi="Calibri" w:eastAsia="SimSun" w:cs="Calibri"/>
+                <w:i w:val="0"/>
+                <w:iCs w:val="0"/>
+                <w:color w:val="000000"/>
+                <w:kern w:val="0"/>
+                <w:sz w:val="22"/>
+                <w:szCs w:val="22"/>
+                <w:u w:val="none"/>
+                <w:lang w:val="en-US" w:eastAsia="zh-CN" w:bidi="ar"/>
+              </w:rPr>
+              <w:t>0</w:t>
+            </w:r>
+          </w:p>
+        </w:tc>
+        <w:tc>
+          <w:tcPr>
+            <w:tcW w:w="1100" w:type="dxa"/>
+            <w:tcBorders>
+              <w:top w:val="nil"/>
+              <w:left w:val="nil"/>
+              <w:bottom w:val="nil"/>
+              <w:right w:val="nil"/>
+            </w:tcBorders>
+            <w:shd w:val="clear" w:color="auto" w:fill="auto"/>
+            <w:noWrap/>
+            <w:vAlign w:val="center"/>
+          </w:tcPr>
+          <w:p>
+            <w:pPr>
+              <w:keepNext w:val="0"/>
+              <w:keepLines w:val="0"/>
+              <w:widowControl/>
+              <w:suppressLineNumbers w:val="0"/>
+              <w:jc w:val="right"/>
+              <w:textAlignment w:val="center"/>
+              <w:rPr>
+                <w:rFonts w:hint="default" w:ascii="Calibri" w:hAnsi="Calibri" w:cs="Calibri"/>
+                <w:i w:val="0"/>
+                <w:iCs w:val="0"/>
+                <w:color w:val="000000"/>
+                <w:sz w:val="22"/>
+                <w:szCs w:val="22"/>
+                <w:u w:val="none"/>
                 <w:lang w:val="en-IN"/>
               </w:rPr>
             </w:pPr>
@@ -1124,101 +1794,7 @@
                 <w:u w:val="none"/>
                 <w:lang w:val="en-IN" w:eastAsia="zh-CN" w:bidi="ar"/>
               </w:rPr>
-              <w:t>30</w:t>
-            </w:r>
-          </w:p>
-        </w:tc>
-        <w:tc>
-          <w:tcPr>
-            <w:tcW w:w="1510" w:type="dxa"/>
-            <w:tcBorders>
-              <w:top w:val="nil"/>
-              <w:left w:val="nil"/>
-              <w:bottom w:val="nil"/>
-              <w:right w:val="nil"/>
-            </w:tcBorders>
-            <w:shd w:val="clear" w:color="auto" w:fill="auto"/>
-            <w:noWrap/>
-            <w:vAlign w:val="center"/>
-          </w:tcPr>
-          <w:p>
-            <w:pPr>
-              <w:keepNext w:val="0"/>
-              <w:keepLines w:val="0"/>
-              <w:widowControl/>
-              <w:suppressLineNumbers w:val="0"/>
-              <w:jc w:val="right"/>
-              <w:textAlignment w:val="center"/>
-              <w:rPr>
-                <w:rFonts w:hint="default" w:ascii="Calibri" w:hAnsi="Calibri" w:cs="Calibri"/>
-                <w:i w:val="0"/>
-                <w:iCs w:val="0"/>
-                <w:color w:val="000000"/>
-                <w:sz w:val="22"/>
-                <w:szCs w:val="22"/>
-                <w:u w:val="none"/>
-              </w:rPr>
-            </w:pPr>
-            <w:r>
-              <w:rPr>
-                <w:rFonts w:hint="default" w:ascii="Calibri" w:hAnsi="Calibri" w:eastAsia="SimSun" w:cs="Calibri"/>
-                <w:i w:val="0"/>
-                <w:iCs w:val="0"/>
-                <w:color w:val="000000"/>
-                <w:kern w:val="0"/>
-                <w:sz w:val="22"/>
-                <w:szCs w:val="22"/>
-                <w:u w:val="none"/>
-                <w:lang w:val="en-US" w:eastAsia="zh-CN" w:bidi="ar"/>
-              </w:rPr>
-              <w:t>0</w:t>
-            </w:r>
-          </w:p>
-        </w:tc>
-        <w:tc>
-          <w:tcPr>
-            <w:tcW w:w="1100" w:type="dxa"/>
-            <w:tcBorders>
-              <w:top w:val="nil"/>
-              <w:left w:val="nil"/>
-              <w:bottom w:val="nil"/>
-              <w:right w:val="nil"/>
-            </w:tcBorders>
-            <w:shd w:val="clear" w:color="auto" w:fill="auto"/>
-            <w:noWrap/>
-            <w:vAlign w:val="center"/>
-          </w:tcPr>
-          <w:p>
-            <w:pPr>
-              <w:keepNext w:val="0"/>
-              <w:keepLines w:val="0"/>
-              <w:widowControl/>
-              <w:suppressLineNumbers w:val="0"/>
-              <w:jc w:val="right"/>
-              <w:textAlignment w:val="center"/>
-              <w:rPr>
-                <w:rFonts w:hint="default" w:ascii="Calibri" w:hAnsi="Calibri" w:cs="Calibri"/>
-                <w:i w:val="0"/>
-                <w:iCs w:val="0"/>
-                <w:color w:val="000000"/>
-                <w:sz w:val="22"/>
-                <w:szCs w:val="22"/>
-                <w:u w:val="none"/>
-              </w:rPr>
-            </w:pPr>
-            <w:r>
-              <w:rPr>
-                <w:rFonts w:hint="default" w:ascii="Calibri" w:hAnsi="Calibri" w:eastAsia="SimSun" w:cs="Calibri"/>
-                <w:i w:val="0"/>
-                <w:iCs w:val="0"/>
-                <w:color w:val="000000"/>
-                <w:kern w:val="0"/>
-                <w:sz w:val="22"/>
-                <w:szCs w:val="22"/>
-                <w:u w:val="none"/>
-                <w:lang w:val="en-US" w:eastAsia="zh-CN" w:bidi="ar"/>
-              </w:rPr>
-              <w:t>150</w:t>
+              <w:t>70</w:t>
             </w:r>
           </w:p>
         </w:tc>
@@ -1241,7 +1817,7 @@
               <w:keepLines w:val="0"/>
               <w:widowControl/>
               <w:suppressLineNumbers w:val="0"/>
-              <w:jc w:val="right"/>
+              <w:jc w:val="left"/>
               <w:textAlignment w:val="center"/>
               <w:rPr>
                 <w:rFonts w:hint="default" w:ascii="Calibri" w:hAnsi="Calibri" w:eastAsia="SimSun" w:cs="Calibri"/>
@@ -1268,7 +1844,6 @@
             <w:insideH w:val="none" w:color="auto" w:sz="0" w:space="0"/>
             <w:insideV w:val="none" w:color="auto" w:sz="0" w:space="0"/>
           </w:tblBorders>
-          <w:shd w:val="clear" w:color="auto" w:fill="auto"/>
           <w:tblCellMar>
             <w:top w:w="0" w:type="dxa"/>
             <w:left w:w="108" w:type="dxa"/>
@@ -1301,590 +1876,6 @@
               <w:jc w:val="left"/>
               <w:textAlignment w:val="center"/>
               <w:rPr>
-                <w:rFonts w:hint="default" w:ascii="Calibri" w:hAnsi="Calibri" w:cs="Calibri"/>
-                <w:i w:val="0"/>
-                <w:iCs w:val="0"/>
-                <w:color w:val="000000"/>
-                <w:sz w:val="22"/>
-                <w:szCs w:val="22"/>
-                <w:u w:val="none"/>
-              </w:rPr>
-            </w:pPr>
-            <w:r>
-              <w:rPr>
-                <w:rFonts w:hint="default" w:ascii="Calibri" w:hAnsi="Calibri" w:eastAsia="SimSun" w:cs="Calibri"/>
-                <w:i w:val="0"/>
-                <w:iCs w:val="0"/>
-                <w:color w:val="000000"/>
-                <w:kern w:val="0"/>
-                <w:sz w:val="22"/>
-                <w:szCs w:val="22"/>
-                <w:u w:val="none"/>
-                <w:lang w:val="en-US" w:eastAsia="zh-CN" w:bidi="ar"/>
-              </w:rPr>
-              <w:t>D</w:t>
-            </w:r>
-          </w:p>
-        </w:tc>
-        <w:tc>
-          <w:tcPr>
-            <w:tcW w:w="2270" w:type="dxa"/>
-            <w:tcBorders>
-              <w:top w:val="nil"/>
-              <w:left w:val="nil"/>
-              <w:bottom w:val="nil"/>
-              <w:right w:val="nil"/>
-            </w:tcBorders>
-            <w:shd w:val="clear" w:color="auto" w:fill="auto"/>
-            <w:noWrap/>
-            <w:vAlign w:val="center"/>
-          </w:tcPr>
-          <w:p>
-            <w:pPr>
-              <w:keepNext w:val="0"/>
-              <w:keepLines w:val="0"/>
-              <w:widowControl/>
-              <w:suppressLineNumbers w:val="0"/>
-              <w:jc w:val="right"/>
-              <w:textAlignment w:val="center"/>
-              <w:rPr>
-                <w:rFonts w:hint="default" w:ascii="Calibri" w:hAnsi="Calibri" w:cs="Calibri"/>
-                <w:i w:val="0"/>
-                <w:iCs w:val="0"/>
-                <w:color w:val="000000"/>
-                <w:sz w:val="22"/>
-                <w:szCs w:val="22"/>
-                <w:u w:val="none"/>
-              </w:rPr>
-            </w:pPr>
-            <w:r>
-              <w:rPr>
-                <w:rFonts w:hint="default" w:ascii="Calibri" w:hAnsi="Calibri" w:eastAsia="SimSun" w:cs="Calibri"/>
-                <w:i w:val="0"/>
-                <w:iCs w:val="0"/>
-                <w:color w:val="000000"/>
-                <w:kern w:val="0"/>
-                <w:sz w:val="22"/>
-                <w:szCs w:val="22"/>
-                <w:u w:val="none"/>
-                <w:lang w:val="en-US" w:eastAsia="zh-CN" w:bidi="ar"/>
-              </w:rPr>
-              <w:t>20</w:t>
-            </w:r>
-          </w:p>
-        </w:tc>
-        <w:tc>
-          <w:tcPr>
-            <w:tcW w:w="1280" w:type="dxa"/>
-            <w:tcBorders>
-              <w:top w:val="nil"/>
-              <w:left w:val="nil"/>
-              <w:bottom w:val="nil"/>
-              <w:right w:val="nil"/>
-            </w:tcBorders>
-            <w:shd w:val="clear" w:color="auto" w:fill="auto"/>
-            <w:noWrap/>
-            <w:vAlign w:val="center"/>
-          </w:tcPr>
-          <w:p>
-            <w:pPr>
-              <w:keepNext w:val="0"/>
-              <w:keepLines w:val="0"/>
-              <w:widowControl/>
-              <w:suppressLineNumbers w:val="0"/>
-              <w:jc w:val="right"/>
-              <w:textAlignment w:val="center"/>
-              <w:rPr>
-                <w:rFonts w:hint="default" w:ascii="Calibri" w:hAnsi="Calibri" w:cs="Calibri"/>
-                <w:i w:val="0"/>
-                <w:iCs w:val="0"/>
-                <w:color w:val="000000"/>
-                <w:sz w:val="22"/>
-                <w:szCs w:val="22"/>
-                <w:u w:val="none"/>
-              </w:rPr>
-            </w:pPr>
-            <w:r>
-              <w:rPr>
-                <w:rFonts w:hint="default" w:ascii="Calibri" w:hAnsi="Calibri" w:eastAsia="SimSun" w:cs="Calibri"/>
-                <w:i w:val="0"/>
-                <w:iCs w:val="0"/>
-                <w:color w:val="000000"/>
-                <w:kern w:val="0"/>
-                <w:sz w:val="22"/>
-                <w:szCs w:val="22"/>
-                <w:u w:val="none"/>
-                <w:lang w:val="en-US" w:eastAsia="zh-CN" w:bidi="ar"/>
-              </w:rPr>
-              <w:t>20</w:t>
-            </w:r>
-          </w:p>
-        </w:tc>
-        <w:tc>
-          <w:tcPr>
-            <w:tcW w:w="1510" w:type="dxa"/>
-            <w:tcBorders>
-              <w:top w:val="nil"/>
-              <w:left w:val="nil"/>
-              <w:bottom w:val="nil"/>
-              <w:right w:val="nil"/>
-            </w:tcBorders>
-            <w:shd w:val="clear" w:color="auto" w:fill="auto"/>
-            <w:noWrap/>
-            <w:vAlign w:val="center"/>
-          </w:tcPr>
-          <w:p>
-            <w:pPr>
-              <w:keepNext w:val="0"/>
-              <w:keepLines w:val="0"/>
-              <w:widowControl/>
-              <w:suppressLineNumbers w:val="0"/>
-              <w:jc w:val="right"/>
-              <w:textAlignment w:val="center"/>
-              <w:rPr>
-                <w:rFonts w:hint="default" w:ascii="Calibri" w:hAnsi="Calibri" w:cs="Calibri"/>
-                <w:i w:val="0"/>
-                <w:iCs w:val="0"/>
-                <w:color w:val="000000"/>
-                <w:sz w:val="22"/>
-                <w:szCs w:val="22"/>
-                <w:u w:val="none"/>
-              </w:rPr>
-            </w:pPr>
-            <w:r>
-              <w:rPr>
-                <w:rFonts w:hint="default" w:ascii="Calibri" w:hAnsi="Calibri" w:eastAsia="SimSun" w:cs="Calibri"/>
-                <w:i w:val="0"/>
-                <w:iCs w:val="0"/>
-                <w:color w:val="000000"/>
-                <w:kern w:val="0"/>
-                <w:sz w:val="22"/>
-                <w:szCs w:val="22"/>
-                <w:u w:val="none"/>
-                <w:lang w:val="en-US" w:eastAsia="zh-CN" w:bidi="ar"/>
-              </w:rPr>
-              <w:t>0</w:t>
-            </w:r>
-          </w:p>
-        </w:tc>
-        <w:tc>
-          <w:tcPr>
-            <w:tcW w:w="1100" w:type="dxa"/>
-            <w:tcBorders>
-              <w:top w:val="nil"/>
-              <w:left w:val="nil"/>
-              <w:bottom w:val="nil"/>
-              <w:right w:val="nil"/>
-            </w:tcBorders>
-            <w:shd w:val="clear" w:color="auto" w:fill="auto"/>
-            <w:noWrap/>
-            <w:vAlign w:val="center"/>
-          </w:tcPr>
-          <w:p>
-            <w:pPr>
-              <w:keepNext w:val="0"/>
-              <w:keepLines w:val="0"/>
-              <w:widowControl/>
-              <w:suppressLineNumbers w:val="0"/>
-              <w:jc w:val="right"/>
-              <w:textAlignment w:val="center"/>
-              <w:rPr>
-                <w:rFonts w:hint="default" w:ascii="Calibri" w:hAnsi="Calibri" w:cs="Calibri"/>
-                <w:i w:val="0"/>
-                <w:iCs w:val="0"/>
-                <w:color w:val="000000"/>
-                <w:sz w:val="22"/>
-                <w:szCs w:val="22"/>
-                <w:u w:val="none"/>
-              </w:rPr>
-            </w:pPr>
-            <w:r>
-              <w:rPr>
-                <w:rFonts w:hint="default" w:ascii="Calibri" w:hAnsi="Calibri" w:eastAsia="SimSun" w:cs="Calibri"/>
-                <w:i w:val="0"/>
-                <w:iCs w:val="0"/>
-                <w:color w:val="000000"/>
-                <w:kern w:val="0"/>
-                <w:sz w:val="22"/>
-                <w:szCs w:val="22"/>
-                <w:u w:val="none"/>
-                <w:lang w:val="en-US" w:eastAsia="zh-CN" w:bidi="ar"/>
-              </w:rPr>
-              <w:t>70</w:t>
-            </w:r>
-          </w:p>
-        </w:tc>
-        <w:tc>
-          <w:tcPr>
-            <w:tcW w:w="4890" w:type="dxa"/>
-            <w:tcBorders>
-              <w:top w:val="nil"/>
-              <w:left w:val="nil"/>
-              <w:bottom w:val="nil"/>
-              <w:right w:val="nil"/>
-            </w:tcBorders>
-            <w:shd w:val="clear" w:color="auto" w:fill="auto"/>
-            <w:noWrap/>
-            <w:vAlign w:val="center"/>
-          </w:tcPr>
-          <w:p>
-            <w:pPr>
-              <w:keepNext w:val="0"/>
-              <w:keepLines w:val="0"/>
-              <w:widowControl/>
-              <w:suppressLineNumbers w:val="0"/>
-              <w:jc w:val="right"/>
-              <w:textAlignment w:val="center"/>
-              <w:rPr>
-                <w:rFonts w:hint="default" w:ascii="Calibri" w:hAnsi="Calibri" w:eastAsia="SimSun" w:cs="Calibri"/>
-                <w:i w:val="0"/>
-                <w:iCs w:val="0"/>
-                <w:color w:val="000000"/>
-                <w:kern w:val="0"/>
-                <w:sz w:val="22"/>
-                <w:szCs w:val="22"/>
-                <w:u w:val="none"/>
-                <w:lang w:val="en-US" w:eastAsia="zh-CN" w:bidi="ar"/>
-              </w:rPr>
-            </w:pPr>
-          </w:p>
-        </w:tc>
-      </w:tr>
-      <w:tr>
-        <w:tblPrEx>
-          <w:tblBorders>
-            <w:top w:val="none" w:color="auto" w:sz="0" w:space="0"/>
-            <w:left w:val="none" w:color="auto" w:sz="0" w:space="0"/>
-            <w:bottom w:val="none" w:color="auto" w:sz="0" w:space="0"/>
-            <w:right w:val="none" w:color="auto" w:sz="0" w:space="0"/>
-            <w:insideH w:val="none" w:color="auto" w:sz="0" w:space="0"/>
-            <w:insideV w:val="none" w:color="auto" w:sz="0" w:space="0"/>
-          </w:tblBorders>
-          <w:shd w:val="clear" w:color="auto" w:fill="auto"/>
-          <w:tblCellMar>
-            <w:top w:w="0" w:type="dxa"/>
-            <w:left w:w="108" w:type="dxa"/>
-            <w:bottom w:w="0" w:type="dxa"/>
-            <w:right w:w="108" w:type="dxa"/>
-          </w:tblCellMar>
-        </w:tblPrEx>
-        <w:trPr>
-          <w:trHeight w:val="290" w:hRule="atLeast"/>
-        </w:trPr>
-        <w:tc>
-          <w:tcPr>
-            <w:tcW w:w="1880" w:type="dxa"/>
-            <w:tcBorders>
-              <w:top w:val="nil"/>
-              <w:left w:val="nil"/>
-              <w:bottom w:val="nil"/>
-              <w:right w:val="nil"/>
-            </w:tcBorders>
-            <w:shd w:val="clear" w:color="auto" w:fill="auto"/>
-            <w:noWrap/>
-            <w:vAlign w:val="center"/>
-          </w:tcPr>
-          <w:p>
-            <w:pPr>
-              <w:keepNext w:val="0"/>
-              <w:keepLines w:val="0"/>
-              <w:widowControl/>
-              <w:suppressLineNumbers w:val="0"/>
-              <w:jc w:val="left"/>
-              <w:textAlignment w:val="center"/>
-              <w:rPr>
-                <w:rFonts w:hint="default" w:ascii="Calibri" w:hAnsi="Calibri" w:cs="Calibri"/>
-                <w:i w:val="0"/>
-                <w:iCs w:val="0"/>
-                <w:color w:val="000000"/>
-                <w:sz w:val="22"/>
-                <w:szCs w:val="22"/>
-                <w:u w:val="none"/>
-              </w:rPr>
-            </w:pPr>
-            <w:r>
-              <w:rPr>
-                <w:rFonts w:hint="default" w:ascii="Calibri" w:hAnsi="Calibri" w:eastAsia="SimSun" w:cs="Calibri"/>
-                <w:i w:val="0"/>
-                <w:iCs w:val="0"/>
-                <w:color w:val="000000"/>
-                <w:kern w:val="0"/>
-                <w:sz w:val="22"/>
-                <w:szCs w:val="22"/>
-                <w:u w:val="none"/>
-                <w:lang w:val="en-US" w:eastAsia="zh-CN" w:bidi="ar"/>
-              </w:rPr>
-              <w:t>E</w:t>
-            </w:r>
-          </w:p>
-        </w:tc>
-        <w:tc>
-          <w:tcPr>
-            <w:tcW w:w="2270" w:type="dxa"/>
-            <w:tcBorders>
-              <w:top w:val="nil"/>
-              <w:left w:val="nil"/>
-              <w:bottom w:val="nil"/>
-              <w:right w:val="nil"/>
-            </w:tcBorders>
-            <w:shd w:val="clear" w:color="auto" w:fill="auto"/>
-            <w:noWrap/>
-            <w:vAlign w:val="center"/>
-          </w:tcPr>
-          <w:p>
-            <w:pPr>
-              <w:keepNext w:val="0"/>
-              <w:keepLines w:val="0"/>
-              <w:widowControl/>
-              <w:suppressLineNumbers w:val="0"/>
-              <w:jc w:val="right"/>
-              <w:textAlignment w:val="center"/>
-              <w:rPr>
-                <w:rFonts w:hint="default" w:ascii="Calibri" w:hAnsi="Calibri" w:cs="Calibri"/>
-                <w:i w:val="0"/>
-                <w:iCs w:val="0"/>
-                <w:color w:val="000000"/>
-                <w:sz w:val="22"/>
-                <w:szCs w:val="22"/>
-                <w:u w:val="none"/>
-              </w:rPr>
-            </w:pPr>
-            <w:r>
-              <w:rPr>
-                <w:rFonts w:hint="default" w:ascii="Calibri" w:hAnsi="Calibri" w:eastAsia="SimSun" w:cs="Calibri"/>
-                <w:i w:val="0"/>
-                <w:iCs w:val="0"/>
-                <w:color w:val="000000"/>
-                <w:kern w:val="0"/>
-                <w:sz w:val="22"/>
-                <w:szCs w:val="22"/>
-                <w:u w:val="none"/>
-                <w:lang w:val="en-US" w:eastAsia="zh-CN" w:bidi="ar"/>
-              </w:rPr>
-              <w:t>20</w:t>
-            </w:r>
-          </w:p>
-        </w:tc>
-        <w:tc>
-          <w:tcPr>
-            <w:tcW w:w="1280" w:type="dxa"/>
-            <w:tcBorders>
-              <w:top w:val="nil"/>
-              <w:left w:val="nil"/>
-              <w:bottom w:val="nil"/>
-              <w:right w:val="nil"/>
-            </w:tcBorders>
-            <w:shd w:val="clear" w:color="auto" w:fill="auto"/>
-            <w:noWrap/>
-            <w:vAlign w:val="center"/>
-          </w:tcPr>
-          <w:p>
-            <w:pPr>
-              <w:keepNext w:val="0"/>
-              <w:keepLines w:val="0"/>
-              <w:widowControl/>
-              <w:suppressLineNumbers w:val="0"/>
-              <w:jc w:val="right"/>
-              <w:textAlignment w:val="center"/>
-              <w:rPr>
-                <w:rFonts w:hint="default" w:ascii="Calibri" w:hAnsi="Calibri" w:cs="Calibri"/>
-                <w:i w:val="0"/>
-                <w:iCs w:val="0"/>
-                <w:color w:val="000000"/>
-                <w:sz w:val="22"/>
-                <w:szCs w:val="22"/>
-                <w:u w:val="none"/>
-              </w:rPr>
-            </w:pPr>
-            <w:r>
-              <w:rPr>
-                <w:rFonts w:hint="default" w:ascii="Calibri" w:hAnsi="Calibri" w:eastAsia="SimSun" w:cs="Calibri"/>
-                <w:i w:val="0"/>
-                <w:iCs w:val="0"/>
-                <w:color w:val="000000"/>
-                <w:kern w:val="0"/>
-                <w:sz w:val="22"/>
-                <w:szCs w:val="22"/>
-                <w:u w:val="none"/>
-                <w:lang w:val="en-US" w:eastAsia="zh-CN" w:bidi="ar"/>
-              </w:rPr>
-              <w:t>20</w:t>
-            </w:r>
-          </w:p>
-        </w:tc>
-        <w:tc>
-          <w:tcPr>
-            <w:tcW w:w="1510" w:type="dxa"/>
-            <w:tcBorders>
-              <w:top w:val="nil"/>
-              <w:left w:val="nil"/>
-              <w:bottom w:val="nil"/>
-              <w:right w:val="nil"/>
-            </w:tcBorders>
-            <w:shd w:val="clear" w:color="auto" w:fill="auto"/>
-            <w:noWrap/>
-            <w:vAlign w:val="center"/>
-          </w:tcPr>
-          <w:p>
-            <w:pPr>
-              <w:keepNext w:val="0"/>
-              <w:keepLines w:val="0"/>
-              <w:widowControl/>
-              <w:suppressLineNumbers w:val="0"/>
-              <w:jc w:val="right"/>
-              <w:textAlignment w:val="center"/>
-              <w:rPr>
-                <w:rFonts w:hint="default" w:ascii="Calibri" w:hAnsi="Calibri" w:cs="Calibri"/>
-                <w:i w:val="0"/>
-                <w:iCs w:val="0"/>
-                <w:color w:val="000000"/>
-                <w:sz w:val="22"/>
-                <w:szCs w:val="22"/>
-                <w:u w:val="none"/>
-              </w:rPr>
-            </w:pPr>
-            <w:r>
-              <w:rPr>
-                <w:rFonts w:hint="default" w:ascii="Calibri" w:hAnsi="Calibri" w:eastAsia="SimSun" w:cs="Calibri"/>
-                <w:i w:val="0"/>
-                <w:iCs w:val="0"/>
-                <w:color w:val="000000"/>
-                <w:kern w:val="0"/>
-                <w:sz w:val="22"/>
-                <w:szCs w:val="22"/>
-                <w:u w:val="none"/>
-                <w:lang w:val="en-US" w:eastAsia="zh-CN" w:bidi="ar"/>
-              </w:rPr>
-              <w:t>0</w:t>
-            </w:r>
-          </w:p>
-        </w:tc>
-        <w:tc>
-          <w:tcPr>
-            <w:tcW w:w="1100" w:type="dxa"/>
-            <w:tcBorders>
-              <w:top w:val="nil"/>
-              <w:left w:val="nil"/>
-              <w:bottom w:val="nil"/>
-              <w:right w:val="nil"/>
-            </w:tcBorders>
-            <w:shd w:val="clear" w:color="auto" w:fill="auto"/>
-            <w:noWrap/>
-            <w:vAlign w:val="center"/>
-          </w:tcPr>
-          <w:p>
-            <w:pPr>
-              <w:keepNext w:val="0"/>
-              <w:keepLines w:val="0"/>
-              <w:widowControl/>
-              <w:suppressLineNumbers w:val="0"/>
-              <w:jc w:val="right"/>
-              <w:textAlignment w:val="center"/>
-              <w:rPr>
-                <w:rFonts w:hint="default" w:ascii="Calibri" w:hAnsi="Calibri" w:cs="Calibri"/>
-                <w:i w:val="0"/>
-                <w:iCs w:val="0"/>
-                <w:color w:val="000000"/>
-                <w:sz w:val="22"/>
-                <w:szCs w:val="22"/>
-                <w:u w:val="none"/>
-              </w:rPr>
-            </w:pPr>
-            <w:r>
-              <w:rPr>
-                <w:rFonts w:hint="default" w:ascii="Calibri" w:hAnsi="Calibri" w:eastAsia="SimSun" w:cs="Calibri"/>
-                <w:i w:val="0"/>
-                <w:iCs w:val="0"/>
-                <w:color w:val="000000"/>
-                <w:kern w:val="0"/>
-                <w:sz w:val="22"/>
-                <w:szCs w:val="22"/>
-                <w:u w:val="none"/>
-                <w:lang w:val="en-US" w:eastAsia="zh-CN" w:bidi="ar"/>
-              </w:rPr>
-              <w:t>80</w:t>
-            </w:r>
-          </w:p>
-        </w:tc>
-        <w:tc>
-          <w:tcPr>
-            <w:tcW w:w="4890" w:type="dxa"/>
-            <w:tcBorders>
-              <w:top w:val="nil"/>
-              <w:left w:val="nil"/>
-              <w:bottom w:val="nil"/>
-              <w:right w:val="nil"/>
-            </w:tcBorders>
-            <w:shd w:val="clear" w:color="auto" w:fill="auto"/>
-            <w:noWrap/>
-            <w:vAlign w:val="center"/>
-          </w:tcPr>
-          <w:p>
-            <w:pPr>
-              <w:keepNext w:val="0"/>
-              <w:keepLines w:val="0"/>
-              <w:widowControl/>
-              <w:suppressLineNumbers w:val="0"/>
-              <w:jc w:val="right"/>
-              <w:textAlignment w:val="center"/>
-              <w:rPr>
-                <w:rFonts w:hint="default" w:ascii="Calibri" w:hAnsi="Calibri" w:eastAsia="SimSun" w:cs="Calibri"/>
-                <w:i w:val="0"/>
-                <w:iCs w:val="0"/>
-                <w:color w:val="000000"/>
-                <w:kern w:val="0"/>
-                <w:sz w:val="22"/>
-                <w:szCs w:val="22"/>
-                <w:u w:val="none"/>
-                <w:lang w:val="en-US" w:eastAsia="zh-CN" w:bidi="ar"/>
-              </w:rPr>
-            </w:pPr>
-          </w:p>
-        </w:tc>
-      </w:tr>
-      <w:tr>
-        <w:tblPrEx>
-          <w:tblBorders>
-            <w:top w:val="none" w:color="auto" w:sz="0" w:space="0"/>
-            <w:left w:val="none" w:color="auto" w:sz="0" w:space="0"/>
-            <w:bottom w:val="none" w:color="auto" w:sz="0" w:space="0"/>
-            <w:right w:val="none" w:color="auto" w:sz="0" w:space="0"/>
-            <w:insideH w:val="none" w:color="auto" w:sz="0" w:space="0"/>
-            <w:insideV w:val="none" w:color="auto" w:sz="0" w:space="0"/>
-          </w:tblBorders>
-          <w:shd w:val="clear" w:color="auto" w:fill="auto"/>
-          <w:tblCellMar>
-            <w:top w:w="0" w:type="dxa"/>
-            <w:left w:w="108" w:type="dxa"/>
-            <w:bottom w:w="0" w:type="dxa"/>
-            <w:right w:w="108" w:type="dxa"/>
-          </w:tblCellMar>
-        </w:tblPrEx>
-        <w:trPr>
-          <w:trHeight w:val="290" w:hRule="atLeast"/>
-        </w:trPr>
-        <w:tc>
-          <w:tcPr>
-            <w:tcW w:w="1880" w:type="dxa"/>
-            <w:tcBorders>
-              <w:top w:val="nil"/>
-              <w:left w:val="nil"/>
-              <w:bottom w:val="nil"/>
-              <w:right w:val="nil"/>
-            </w:tcBorders>
-            <w:shd w:val="clear" w:color="auto" w:fill="auto"/>
-            <w:noWrap/>
-            <w:vAlign w:val="center"/>
-          </w:tcPr>
-          <w:p>
-            <w:pPr>
-              <w:keepNext w:val="0"/>
-              <w:keepLines w:val="0"/>
-              <w:widowControl/>
-              <w:suppressLineNumbers w:val="0"/>
-              <w:jc w:val="left"/>
-              <w:textAlignment w:val="center"/>
-              <w:rPr>
                 <w:rFonts w:hint="default" w:ascii="Calibri" w:hAnsi="Calibri" w:eastAsia="SimSun" w:cs="Calibri"/>
                 <w:i w:val="0"/>
                 <w:iCs w:val="0"/>
@@ -2089,10 +2080,110 @@
       </w:r>
       <w:r>
         <w:rPr>
+          <w:rFonts w:hint="default" w:ascii="Calibri" w:hAnsi="Calibri" w:eastAsia="SimSun" w:cs="Calibri"/>
+          <w:i w:val="0"/>
+          <w:iCs w:val="0"/>
+          <w:color w:val="000000"/>
+          <w:kern w:val="0"/>
+          <w:sz w:val="22"/>
+          <w:szCs w:val="22"/>
+          <w:u w:val="none"/>
+          <w:lang w:val="en-IN" w:eastAsia="zh-CN" w:bidi="ar"/>
+        </w:rPr>
+        <w:t>IBM</w:t>
+      </w:r>
+      <w:r>
+        <w:rPr>
           <w:rFonts w:hint="default"/>
           <w:lang w:val="en-IN"/>
         </w:rPr>
-        <w:t xml:space="preserve">A,B,C,D,E </w:t>
+        <w:t>,</w:t>
+      </w:r>
+      <w:r>
+        <w:rPr>
+          <w:rFonts w:hint="default" w:ascii="Calibri" w:hAnsi="Calibri" w:eastAsia="SimSun" w:cs="Calibri"/>
+          <w:i w:val="0"/>
+          <w:iCs w:val="0"/>
+          <w:color w:val="000000"/>
+          <w:kern w:val="0"/>
+          <w:sz w:val="22"/>
+          <w:szCs w:val="22"/>
+          <w:u w:val="none"/>
+          <w:lang w:val="en-IN" w:eastAsia="zh-CN" w:bidi="ar"/>
+        </w:rPr>
+        <w:t>MSFT</w:t>
+      </w:r>
+      <w:r>
+        <w:rPr>
+          <w:rFonts w:hint="default"/>
+          <w:lang w:val="en-IN"/>
+        </w:rPr>
+        <w:t>,</w:t>
+      </w:r>
+      <w:r>
+        <w:rPr>
+          <w:rFonts w:hint="default" w:ascii="Calibri" w:hAnsi="Calibri" w:eastAsia="SimSun" w:cs="Calibri"/>
+          <w:i w:val="0"/>
+          <w:iCs w:val="0"/>
+          <w:color w:val="000000"/>
+          <w:kern w:val="0"/>
+          <w:sz w:val="22"/>
+          <w:szCs w:val="22"/>
+          <w:u w:val="none"/>
+          <w:lang w:val="en-IN" w:eastAsia="zh-CN" w:bidi="ar"/>
+        </w:rPr>
+        <w:t>ORCL</w:t>
+      </w:r>
+      <w:r>
+        <w:rPr>
+          <w:rFonts w:hint="default"/>
+          <w:lang w:val="en-IN"/>
+        </w:rPr>
+        <w:t>,</w:t>
+      </w:r>
+      <w:r>
+        <w:rPr>
+          <w:rFonts w:hint="default" w:ascii="Calibri" w:hAnsi="Calibri" w:eastAsia="SimSun" w:cs="Calibri"/>
+          <w:i w:val="0"/>
+          <w:iCs w:val="0"/>
+          <w:color w:val="000000"/>
+          <w:kern w:val="0"/>
+          <w:sz w:val="22"/>
+          <w:szCs w:val="22"/>
+          <w:u w:val="none"/>
+          <w:lang w:val="en-IN" w:eastAsia="zh-CN" w:bidi="ar"/>
+        </w:rPr>
+        <w:t>AAPL</w:t>
+      </w:r>
+      <w:r>
+        <w:rPr>
+          <w:rFonts w:hint="default"/>
+          <w:lang w:val="en-IN"/>
+        </w:rPr>
+        <w:t>,</w:t>
+      </w:r>
+      <w:r>
+        <w:rPr>
+          <w:rFonts w:hint="default" w:ascii="Calibri" w:hAnsi="Calibri" w:eastAsia="SimSun" w:cs="Calibri"/>
+          <w:i w:val="0"/>
+          <w:iCs w:val="0"/>
+          <w:color w:val="000000"/>
+          <w:kern w:val="0"/>
+          <w:sz w:val="22"/>
+          <w:szCs w:val="22"/>
+          <w:u w:val="none"/>
+          <w:lang w:val="en-IN" w:eastAsia="zh-CN" w:bidi="ar"/>
+        </w:rPr>
+        <w:t>HD</w:t>
+      </w:r>
+      <w:bookmarkStart w:id="0" w:name="_GoBack"/>
+      <w:bookmarkEnd w:id="0"/>
+      <w:r>
+        <w:rPr>
+          <w:rFonts w:hint="default"/>
+          <w:lang w:val="en-IN"/>
+        </w:rPr>
+        <w:t xml:space="preserve"> </w:t>
       </w:r>
       <w:r>
         <w:rPr>
@@ -2133,8 +2224,6 @@
           <w:rFonts w:hint="default"/>
         </w:rPr>
       </w:pPr>
-      <w:bookmarkStart w:id="0" w:name="_GoBack"/>
-      <w:bookmarkEnd w:id="0"/>
       <w:r>
         <w:rPr>
           <w:rFonts w:hint="default"/>
@@ -2333,7 +2422,7 @@
     <w:lsdException w:qFormat="1" w:unhideWhenUsed="0" w:uiPriority="0" w:semiHidden="0" w:name="Title"/>
     <w:lsdException w:unhideWhenUsed="0" w:uiPriority="0" w:semiHidden="0" w:name="Closing"/>
     <w:lsdException w:unhideWhenUsed="0" w:uiPriority="0" w:semiHidden="0" w:name="Signature"/>
-    <w:lsdException w:unhideWhenUsed="0" w:uiPriority="0" w:name="Default Paragraph Font"/>
+    <w:lsdException w:qFormat="1" w:unhideWhenUsed="0" w:uiPriority="0" w:name="Default Paragraph Font"/>
     <w:lsdException w:unhideWhenUsed="0" w:uiPriority="0" w:semiHidden="0" w:name="Body Text"/>
     <w:lsdException w:unhideWhenUsed="0" w:uiPriority="0" w:semiHidden="0" w:name="Body Text Indent"/>
     <w:lsdException w:unhideWhenUsed="0" w:uiPriority="0" w:semiHidden="0" w:name="List Continue"/>
@@ -2529,6 +2618,7 @@
   <w:style w:type="character" w:default="1" w:styleId="2">
     <w:name w:val="Default Paragraph Font"/>
     <w:semiHidden/>
+    <w:qFormat/>
     <w:uiPriority w:val="0"/>
   </w:style>
   <w:style w:type="table" w:default="1" w:styleId="3">

</xml_diff>